<commit_message>
Updated project documentation and demonstration files
</commit_message>
<xml_diff>
--- a/8.Project Demonstration/Demonstration of Proposed Features.docx
+++ b/8.Project Demonstration/Demonstration of Proposed Features.docx
@@ -4,17 +4,29 @@
   <w:body>
     <w:p>
       <w:pPr>
-        <w:pStyle w:val="Heading1"/>
+        <w:spacing w:before="480" w:after="240"/>
       </w:pPr>
       <w:r>
+        <w:rPr>
+          <w:rFonts w:ascii="Arial" w:hAnsi="Arial"/>
+          <w:b/>
+          <w:color w:val="1F4E79"/>
+          <w:sz w:val="44"/>
+        </w:rPr>
         <w:t>Demonstration of Proposed Features</w:t>
       </w:r>
     </w:p>
     <w:p>
       <w:pPr>
-        <w:pStyle w:val="Heading2"/>
+        <w:pStyle w:val="Heading1"/>
+        <w:spacing w:before="240" w:after="120"/>
       </w:pPr>
       <w:r>
+        <w:rPr>
+          <w:rFonts w:ascii="Arial" w:hAnsi="Arial"/>
+          <w:color w:val="1F4E79"/>
+          <w:sz w:val="36"/>
+        </w:rPr>
         <w:t>1. Overview</w:t>
       </w:r>
     </w:p>
@@ -24,54 +36,46 @@
       </w:r>
     </w:p>
     <w:p>
+      <w:pPr>
+        <w:pStyle w:val="Heading1"/>
+        <w:spacing w:before="240" w:after="120"/>
+      </w:pPr>
       <w:r>
-        <w:t>---</w:t>
+        <w:rPr>
+          <w:rFonts w:ascii="Arial" w:hAnsi="Arial"/>
+          <w:color w:val="1F4E79"/>
+          <w:sz w:val="36"/>
+        </w:rPr>
+        <w:t>2. Demonstrated Features</w:t>
       </w:r>
     </w:p>
     <w:p>
       <w:pPr>
         <w:pStyle w:val="Heading2"/>
+        <w:spacing w:before="240" w:after="120"/>
       </w:pPr>
       <w:r>
-        <w:t>2. Demonstrated Features</w:t>
+        <w:rPr>
+          <w:rFonts w:ascii="Arial" w:hAnsi="Arial"/>
+          <w:color w:val="3F3F3F"/>
+          <w:sz w:val="28"/>
+        </w:rPr>
+        <w:t>2.1 Feature 1: Landing Page Dashboard (home.html)</w:t>
       </w:r>
     </w:p>
     <w:p>
-      <w:pPr>
-        <w:pStyle w:val="Heading3"/>
-      </w:pPr>
       <w:r>
-        <w:t>2.1 Feature 1: Landing Page Dashboard (`home.html`)</w:t>
+        <w:t xml:space="preserve">Visuals: </w:t>
       </w:r>
     </w:p>
     <w:p>
-      <w:pPr>
-        <w:pStyle w:val="ListBullet"/>
-      </w:pPr>
-      <w:r/>
       <w:r>
-        <w:rPr>
-          <w:b/>
-        </w:rPr>
-        <w:t>Visuals</w:t>
-      </w:r>
-      <w:r>
-        <w:t>: A responsive layout utilizing a dark gradient background with floating particle effects.</w:t>
+        <w:t>A responsive layout utilizing a dark gradient background with floating particle effects.</w:t>
       </w:r>
     </w:p>
     <w:p>
-      <w:pPr>
-        <w:pStyle w:val="ListBullet"/>
-      </w:pPr>
-      <w:r/>
       <w:r>
-        <w:rPr>
-          <w:b/>
-        </w:rPr>
-        <w:t>Components</w:t>
-      </w:r>
-      <w:r>
-        <w:t>:</w:t>
+        <w:t>Components:</w:t>
       </w:r>
     </w:p>
     <w:p>
@@ -79,7 +83,7 @@
         <w:pStyle w:val="ListBullet"/>
       </w:pPr>
       <w:r>
-        <w:t>Hero section explaining the goal of the HDI Predictor.</w:t>
+        <w:t>• Hero section explaining the goal of the HDI Predictor.</w:t>
       </w:r>
     </w:p>
     <w:p>
@@ -87,7 +91,7 @@
         <w:pStyle w:val="ListBullet"/>
       </w:pPr>
       <w:r>
-        <w:t>Three glassmorphic cards representing the three dimensions of HDI: Health, Knowledge/Education, and Standard of Living.</w:t>
+        <w:t>• Three glassmorphic cards representing the three dimensions of HDI: Health, Knowledge/Education, and Standard of Living.</w:t>
       </w:r>
     </w:p>
     <w:p>
@@ -95,45 +99,36 @@
         <w:pStyle w:val="ListBullet"/>
       </w:pPr>
       <w:r>
-        <w:t>Call-To-Action (CTA) button leading users to the interactive prediction form.</w:t>
+        <w:t>• Call-To-Action (CTA) button leading users to the interactive prediction form.</w:t>
       </w:r>
     </w:p>
     <w:p>
       <w:pPr>
-        <w:pStyle w:val="Heading3"/>
+        <w:pStyle w:val="Heading2"/>
+        <w:spacing w:before="240" w:after="120"/>
       </w:pPr>
       <w:r>
-        <w:t>2.2 Feature 2: Interactive Input Form (`indexnew.html`)</w:t>
+        <w:rPr>
+          <w:rFonts w:ascii="Arial" w:hAnsi="Arial"/>
+          <w:color w:val="3F3F3F"/>
+          <w:sz w:val="28"/>
+        </w:rPr>
+        <w:t>2.2 Feature 2: Interactive Input Form (indexnew.html)</w:t>
       </w:r>
     </w:p>
     <w:p>
-      <w:pPr>
-        <w:pStyle w:val="ListBullet"/>
-      </w:pPr>
-      <w:r/>
       <w:r>
-        <w:rPr>
-          <w:b/>
-        </w:rPr>
-        <w:t>Visuals</w:t>
-      </w:r>
-      <w:r>
-        <w:t>: A 2-column validated form accepting the key developmental indicators as inputs.</w:t>
+        <w:t xml:space="preserve">Visuals: </w:t>
       </w:r>
     </w:p>
     <w:p>
-      <w:pPr>
-        <w:pStyle w:val="ListBullet"/>
-      </w:pPr>
-      <w:r/>
       <w:r>
-        <w:rPr>
-          <w:b/>
-        </w:rPr>
-        <w:t>Form Inputs &amp; Ranges</w:t>
+        <w:t>A 2-column validated form accepting the key developmental indicators as inputs.</w:t>
       </w:r>
+    </w:p>
+    <w:p>
       <w:r>
-        <w:t>:</w:t>
+        <w:t>Form Inputs &amp; Ranges:</w:t>
       </w:r>
     </w:p>
     <w:p>
@@ -141,7 +136,7 @@
         <w:pStyle w:val="ListBullet"/>
       </w:pPr>
       <w:r>
-        <w:t>Country name (categorical dropdown loaded from training encoder).</w:t>
+        <w:t>• Country name (categorical dropdown loaded from training encoder).</w:t>
       </w:r>
     </w:p>
     <w:p>
@@ -149,7 +144,7 @@
         <w:pStyle w:val="ListBullet"/>
       </w:pPr>
       <w:r>
-        <w:t>Life Expectancy (50 to 85 years).</w:t>
+        <w:t>• Life Expectancy (50 to 85 years).</w:t>
       </w:r>
     </w:p>
     <w:p>
@@ -157,7 +152,7 @@
         <w:pStyle w:val="ListBullet"/>
       </w:pPr>
       <w:r>
-        <w:t>Expected Years of Schooling (5 to 20 years).</w:t>
+        <w:t>• Expected Years of Schooling (5 to 20 years).</w:t>
       </w:r>
     </w:p>
     <w:p>
@@ -165,7 +160,7 @@
         <w:pStyle w:val="ListBullet"/>
       </w:pPr>
       <w:r>
-        <w:t>Mean Years of Schooling (3 to 15 years).</w:t>
+        <w:t>• Mean Years of Schooling (3 to 15 years).</w:t>
       </w:r>
     </w:p>
     <w:p>
@@ -173,110 +168,455 @@
         <w:pStyle w:val="ListBullet"/>
       </w:pPr>
       <w:r>
-        <w:t>GNI per Capita ($500 to $75,000).</w:t>
+        <w:t>• GNI per Capita ($500 to $75,000).</w:t>
       </w:r>
     </w:p>
     <w:p>
       <w:pPr>
-        <w:pStyle w:val="Heading3"/>
+        <w:pStyle w:val="Heading2"/>
+        <w:spacing w:before="240" w:after="120"/>
       </w:pPr>
       <w:r>
+        <w:rPr>
+          <w:rFonts w:ascii="Arial" w:hAnsi="Arial"/>
+          <w:color w:val="3F3F3F"/>
+          <w:sz w:val="28"/>
+        </w:rPr>
         <w:t>2.3 Feature 3: Dynamic Result Visualizations</w:t>
+      </w:r>
+    </w:p>
+    <w:p>
+      <w:r>
+        <w:t xml:space="preserve">Visuals: </w:t>
+      </w:r>
+    </w:p>
+    <w:p>
+      <w:r>
+        <w:t>Real-time prediction rendering featuring score badges, gauges, and insights.</w:t>
+      </w:r>
+    </w:p>
+    <w:p>
+      <w:r>
+        <w:t>Key Components:</w:t>
       </w:r>
     </w:p>
     <w:p>
       <w:pPr>
         <w:pStyle w:val="ListBullet"/>
       </w:pPr>
-      <w:r/>
       <w:r>
-        <w:rPr>
-          <w:b/>
-        </w:rPr>
-        <w:t>Visuals</w:t>
-      </w:r>
-      <w:r>
-        <w:t>: Real-time prediction rendering featuring score badges, gauges, and insights.</w:t>
+        <w:t>• Predicted Score: Large numerical indicator.</w:t>
       </w:r>
     </w:p>
     <w:p>
       <w:pPr>
         <w:pStyle w:val="ListBullet"/>
       </w:pPr>
-      <w:r/>
       <w:r>
-        <w:rPr>
-          <w:b/>
-        </w:rPr>
-        <w:t>Key Components</w:t>
-      </w:r>
-      <w:r>
-        <w:t>:</w:t>
+        <w:t>• Tier Badge: Standard UNDP categories (Very High, High, Medium, Low) color-coded appropriately (green, blue, orange, red).</w:t>
       </w:r>
     </w:p>
     <w:p>
       <w:pPr>
         <w:pStyle w:val="ListBullet"/>
       </w:pPr>
-      <w:r/>
       <w:r>
-        <w:rPr>
-          <w:b/>
-        </w:rPr>
-        <w:t>Predicted Score</w:t>
-      </w:r>
-      <w:r>
-        <w:t>: Large numerical indicator.</w:t>
+        <w:t>• HDI Gauge: A gradient progress meter positioning the country's level on the full human development spectrum.</w:t>
       </w:r>
     </w:p>
     <w:p>
       <w:pPr>
         <w:pStyle w:val="ListBullet"/>
       </w:pPr>
-      <w:r/>
       <w:r>
-        <w:rPr>
-          <w:b/>
-        </w:rPr>
-        <w:t>Tier Badge</w:t>
-      </w:r>
-      <w:r>
-        <w:t>: Standard UNDP categories (Very High, High, Medium, Low) color-coded appropriately (green, blue, orange, red).</w:t>
+        <w:t>• Actionable Insights: Targeted recommendations for improvement based on the predicted tier.</w:t>
       </w:r>
     </w:p>
     <w:p>
       <w:pPr>
-        <w:pStyle w:val="ListBullet"/>
+        <w:pStyle w:val="Heading1"/>
+        <w:spacing w:before="240" w:after="120"/>
       </w:pPr>
-      <w:r/>
       <w:r>
         <w:rPr>
-          <w:b/>
+          <w:rFonts w:ascii="Arial" w:hAnsi="Arial"/>
+          <w:color w:val="1F4E79"/>
+          <w:sz w:val="36"/>
         </w:rPr>
-        <w:t>HDI Gauge</w:t>
-      </w:r>
-      <w:r>
-        <w:t>: A gradient progress meter positioning the country's level on the full human development spectrum.</w:t>
+        <w:t>3. Feature Demonstrators &amp; Presenters</w:t>
       </w:r>
     </w:p>
     <w:p>
+      <w:r>
+        <w:t>To ensure a structured demonstration, each proposed feature of the HDI Prediction System will be showcased by its respective builder/developer during the presentation session:</w:t>
+      </w:r>
+    </w:p>
+    <w:tbl>
+      <w:tblPr>
+        <w:tblStyle w:val="TableGrid"/>
+        <w:tblW w:type="auto" w:w="0"/>
+        <w:tblLook w:firstColumn="1" w:firstRow="1" w:lastColumn="0" w:lastRow="0" w:noHBand="0" w:noVBand="1" w:val="04A0"/>
+      </w:tblPr>
+      <w:tblGrid>
+        <w:gridCol w:w="3120"/>
+        <w:gridCol w:w="3120"/>
+        <w:gridCol w:w="3120"/>
+      </w:tblGrid>
+      <w:tr>
+        <w:tc>
+          <w:tcPr>
+            <w:tcW w:type="dxa" w:w="3120"/>
+            <w:tcMar>
+              <w:top w:w="80" w:type="dxa"/>
+              <w:bottom w:w="80" w:type="dxa"/>
+              <w:left w:w="120" w:type="dxa"/>
+              <w:right w:w="120" w:type="dxa"/>
+            </w:tcMar>
+            <w:shd w:fill="1F4E79"/>
+          </w:tcPr>
+          <w:p>
+            <w:pPr>
+              <w:jc w:val="left"/>
+            </w:pPr>
+            <w:r>
+              <w:rPr>
+                <w:rFonts w:ascii="Arial" w:hAnsi="Arial"/>
+                <w:b/>
+                <w:color w:val="FFFFFF"/>
+                <w:sz w:val="20"/>
+              </w:rPr>
+              <w:t>Proposed Feature / Module</w:t>
+            </w:r>
+          </w:p>
+        </w:tc>
+        <w:tc>
+          <w:tcPr>
+            <w:tcW w:type="dxa" w:w="3120"/>
+            <w:tcMar>
+              <w:top w:w="80" w:type="dxa"/>
+              <w:bottom w:w="80" w:type="dxa"/>
+              <w:left w:w="120" w:type="dxa"/>
+              <w:right w:w="120" w:type="dxa"/>
+            </w:tcMar>
+            <w:shd w:fill="1F4E79"/>
+          </w:tcPr>
+          <w:p>
+            <w:pPr>
+              <w:jc w:val="left"/>
+            </w:pPr>
+            <w:r>
+              <w:rPr>
+                <w:rFonts w:ascii="Arial" w:hAnsi="Arial"/>
+                <w:b/>
+                <w:color w:val="FFFFFF"/>
+                <w:sz w:val="20"/>
+              </w:rPr>
+              <w:t>Primary Presenter</w:t>
+            </w:r>
+          </w:p>
+        </w:tc>
+        <w:tc>
+          <w:tcPr>
+            <w:tcW w:type="dxa" w:w="3120"/>
+            <w:tcMar>
+              <w:top w:w="80" w:type="dxa"/>
+              <w:bottom w:w="80" w:type="dxa"/>
+              <w:left w:w="120" w:type="dxa"/>
+              <w:right w:w="120" w:type="dxa"/>
+            </w:tcMar>
+            <w:shd w:fill="1F4E79"/>
+          </w:tcPr>
+          <w:p>
+            <w:pPr>
+              <w:jc w:val="left"/>
+            </w:pPr>
+            <w:r>
+              <w:rPr>
+                <w:rFonts w:ascii="Arial" w:hAnsi="Arial"/>
+                <w:b/>
+                <w:color w:val="FFFFFF"/>
+                <w:sz w:val="20"/>
+              </w:rPr>
+              <w:t>Assigned Role</w:t>
+            </w:r>
+          </w:p>
+        </w:tc>
+      </w:tr>
+      <w:tr>
+        <w:tc>
+          <w:tcPr>
+            <w:tcW w:type="dxa" w:w="3120"/>
+            <w:tcMar>
+              <w:top w:w="80" w:type="dxa"/>
+              <w:bottom w:w="80" w:type="dxa"/>
+              <w:left w:w="120" w:type="dxa"/>
+              <w:right w:w="120" w:type="dxa"/>
+            </w:tcMar>
+          </w:tcPr>
+          <w:p>
+            <w:r>
+              <w:rPr>
+                <w:rFonts w:ascii="Arial" w:hAnsi="Arial"/>
+                <w:color w:val="000000"/>
+                <w:sz w:val="20"/>
+              </w:rPr>
+              <w:t>Feature 1: Landing Page Dashboard (home.html)</w:t>
+            </w:r>
+          </w:p>
+        </w:tc>
+        <w:tc>
+          <w:tcPr>
+            <w:tcW w:type="dxa" w:w="3120"/>
+            <w:tcMar>
+              <w:top w:w="80" w:type="dxa"/>
+              <w:bottom w:w="80" w:type="dxa"/>
+              <w:left w:w="120" w:type="dxa"/>
+              <w:right w:w="120" w:type="dxa"/>
+            </w:tcMar>
+          </w:tcPr>
+          <w:p>
+            <w:r>
+              <w:rPr>
+                <w:rFonts w:ascii="Arial" w:hAnsi="Arial"/>
+                <w:color w:val="000000"/>
+                <w:sz w:val="20"/>
+              </w:rPr>
+              <w:t>Jaswanth Yadav Keerthi</w:t>
+            </w:r>
+          </w:p>
+        </w:tc>
+        <w:tc>
+          <w:tcPr>
+            <w:tcW w:type="dxa" w:w="3120"/>
+            <w:tcMar>
+              <w:top w:w="80" w:type="dxa"/>
+              <w:bottom w:w="80" w:type="dxa"/>
+              <w:left w:w="120" w:type="dxa"/>
+              <w:right w:w="120" w:type="dxa"/>
+            </w:tcMar>
+          </w:tcPr>
+          <w:p>
+            <w:r>
+              <w:rPr>
+                <w:rFonts w:ascii="Arial" w:hAnsi="Arial"/>
+                <w:color w:val="000000"/>
+                <w:sz w:val="20"/>
+              </w:rPr>
+              <w:t>Web Developer / UI Designer</w:t>
+            </w:r>
+          </w:p>
+        </w:tc>
+      </w:tr>
+      <w:tr>
+        <w:tc>
+          <w:tcPr>
+            <w:tcW w:type="dxa" w:w="3120"/>
+            <w:tcMar>
+              <w:top w:w="80" w:type="dxa"/>
+              <w:bottom w:w="80" w:type="dxa"/>
+              <w:left w:w="120" w:type="dxa"/>
+              <w:right w:w="120" w:type="dxa"/>
+            </w:tcMar>
+            <w:shd w:fill="F2F5F8"/>
+          </w:tcPr>
+          <w:p>
+            <w:r>
+              <w:rPr>
+                <w:rFonts w:ascii="Arial" w:hAnsi="Arial"/>
+                <w:color w:val="000000"/>
+                <w:sz w:val="20"/>
+              </w:rPr>
+              <w:t>Feature 2: Interactive Input Form (indexnew.html)</w:t>
+            </w:r>
+          </w:p>
+        </w:tc>
+        <w:tc>
+          <w:tcPr>
+            <w:tcW w:type="dxa" w:w="3120"/>
+            <w:tcMar>
+              <w:top w:w="80" w:type="dxa"/>
+              <w:bottom w:w="80" w:type="dxa"/>
+              <w:left w:w="120" w:type="dxa"/>
+              <w:right w:w="120" w:type="dxa"/>
+            </w:tcMar>
+            <w:shd w:fill="F2F5F8"/>
+          </w:tcPr>
+          <w:p>
+            <w:r>
+              <w:rPr>
+                <w:rFonts w:ascii="Arial" w:hAnsi="Arial"/>
+                <w:color w:val="000000"/>
+                <w:sz w:val="20"/>
+              </w:rPr>
+              <w:t>Jaswanth Yadav Keerthi</w:t>
+            </w:r>
+          </w:p>
+        </w:tc>
+        <w:tc>
+          <w:tcPr>
+            <w:tcW w:type="dxa" w:w="3120"/>
+            <w:tcMar>
+              <w:top w:w="80" w:type="dxa"/>
+              <w:bottom w:w="80" w:type="dxa"/>
+              <w:left w:w="120" w:type="dxa"/>
+              <w:right w:w="120" w:type="dxa"/>
+            </w:tcMar>
+            <w:shd w:fill="F2F5F8"/>
+          </w:tcPr>
+          <w:p>
+            <w:r>
+              <w:rPr>
+                <w:rFonts w:ascii="Arial" w:hAnsi="Arial"/>
+                <w:color w:val="000000"/>
+                <w:sz w:val="20"/>
+              </w:rPr>
+              <w:t>Web Developer / UI Designer</w:t>
+            </w:r>
+          </w:p>
+        </w:tc>
+      </w:tr>
+      <w:tr>
+        <w:tc>
+          <w:tcPr>
+            <w:tcW w:type="dxa" w:w="3120"/>
+            <w:tcMar>
+              <w:top w:w="80" w:type="dxa"/>
+              <w:bottom w:w="80" w:type="dxa"/>
+              <w:left w:w="120" w:type="dxa"/>
+              <w:right w:w="120" w:type="dxa"/>
+            </w:tcMar>
+          </w:tcPr>
+          <w:p>
+            <w:r>
+              <w:rPr>
+                <w:rFonts w:ascii="Arial" w:hAnsi="Arial"/>
+                <w:color w:val="000000"/>
+                <w:sz w:val="20"/>
+              </w:rPr>
+              <w:t>Feature 3: Dynamic Result Visualizations (Gauge &amp; Insights)</w:t>
+            </w:r>
+          </w:p>
+        </w:tc>
+        <w:tc>
+          <w:tcPr>
+            <w:tcW w:type="dxa" w:w="3120"/>
+            <w:tcMar>
+              <w:top w:w="80" w:type="dxa"/>
+              <w:bottom w:w="80" w:type="dxa"/>
+              <w:left w:w="120" w:type="dxa"/>
+              <w:right w:w="120" w:type="dxa"/>
+            </w:tcMar>
+          </w:tcPr>
+          <w:p>
+            <w:r>
+              <w:rPr>
+                <w:rFonts w:ascii="Arial" w:hAnsi="Arial"/>
+                <w:color w:val="000000"/>
+                <w:sz w:val="20"/>
+              </w:rPr>
+              <w:t>Swapna Beldhari</w:t>
+            </w:r>
+          </w:p>
+        </w:tc>
+        <w:tc>
+          <w:tcPr>
+            <w:tcW w:type="dxa" w:w="3120"/>
+            <w:tcMar>
+              <w:top w:w="80" w:type="dxa"/>
+              <w:bottom w:w="80" w:type="dxa"/>
+              <w:left w:w="120" w:type="dxa"/>
+              <w:right w:w="120" w:type="dxa"/>
+            </w:tcMar>
+          </w:tcPr>
+          <w:p>
+            <w:r>
+              <w:rPr>
+                <w:rFonts w:ascii="Arial" w:hAnsi="Arial"/>
+                <w:color w:val="000000"/>
+                <w:sz w:val="20"/>
+              </w:rPr>
+              <w:t>Data Scientist / ML Engineer</w:t>
+            </w:r>
+          </w:p>
+        </w:tc>
+      </w:tr>
+      <w:tr>
+        <w:tc>
+          <w:tcPr>
+            <w:tcW w:type="dxa" w:w="3120"/>
+            <w:tcMar>
+              <w:top w:w="80" w:type="dxa"/>
+              <w:bottom w:w="80" w:type="dxa"/>
+              <w:left w:w="120" w:type="dxa"/>
+              <w:right w:w="120" w:type="dxa"/>
+            </w:tcMar>
+            <w:shd w:fill="F2F5F8"/>
+          </w:tcPr>
+          <w:p>
+            <w:r>
+              <w:rPr>
+                <w:rFonts w:ascii="Arial" w:hAnsi="Arial"/>
+                <w:color w:val="000000"/>
+                <w:sz w:val="20"/>
+              </w:rPr>
+              <w:t>Session Overview &amp; Joint Q&amp;A Segment</w:t>
+            </w:r>
+          </w:p>
+        </w:tc>
+        <w:tc>
+          <w:tcPr>
+            <w:tcW w:type="dxa" w:w="3120"/>
+            <w:tcMar>
+              <w:top w:w="80" w:type="dxa"/>
+              <w:bottom w:w="80" w:type="dxa"/>
+              <w:left w:w="120" w:type="dxa"/>
+              <w:right w:w="120" w:type="dxa"/>
+            </w:tcMar>
+            <w:shd w:fill="F2F5F8"/>
+          </w:tcPr>
+          <w:p>
+            <w:r>
+              <w:rPr>
+                <w:rFonts w:ascii="Arial" w:hAnsi="Arial"/>
+                <w:color w:val="000000"/>
+                <w:sz w:val="20"/>
+              </w:rPr>
+              <w:t>Sai Kiran Bandi</w:t>
+            </w:r>
+          </w:p>
+        </w:tc>
+        <w:tc>
+          <w:tcPr>
+            <w:tcW w:type="dxa" w:w="3120"/>
+            <w:tcMar>
+              <w:top w:w="80" w:type="dxa"/>
+              <w:bottom w:w="80" w:type="dxa"/>
+              <w:left w:w="120" w:type="dxa"/>
+              <w:right w:w="120" w:type="dxa"/>
+            </w:tcMar>
+            <w:shd w:fill="F2F5F8"/>
+          </w:tcPr>
+          <w:p>
+            <w:r>
+              <w:rPr>
+                <w:rFonts w:ascii="Arial" w:hAnsi="Arial"/>
+                <w:color w:val="000000"/>
+                <w:sz w:val="20"/>
+              </w:rPr>
+              <w:t>Lead Developer / Moderator</w:t>
+            </w:r>
+          </w:p>
+        </w:tc>
+      </w:tr>
+    </w:tbl>
+    <w:p>
       <w:pPr>
-        <w:pStyle w:val="ListBullet"/>
+        <w:spacing w:before="80" w:after="160"/>
       </w:pPr>
-      <w:r/>
-      <w:r>
-        <w:rPr>
-          <w:b/>
-        </w:rPr>
-        <w:t>Actionable Insights</w:t>
-      </w:r>
-      <w:r>
-        <w:t>: Targeted recommendations for improvement based on the predicted tier.</w:t>
-      </w:r>
     </w:p>
     <w:sectPr>
       <w:pgSz w:w="12240" w:h="15840"/>
-      <w:pgMar w:top="1440" w:right="1800" w:bottom="1440" w:left="1800" w:header="720" w:footer="720" w:gutter="0"/>
+      <w:pgMar w:top="1440" w:right="1440" w:bottom="1440" w:left="1440" w:header="720" w:footer="720" w:gutter="0"/>
       <w:cols w:space="720"/>
       <w:docGrid w:linePitch="360"/>
     </w:sectPr>
@@ -647,9 +987,12 @@
     <w:name w:val="Normal"/>
     <w:qFormat/>
     <w:rsid w:val="00FC693F"/>
+    <w:pPr>
+      <w:spacing w:line="276" w:lineRule="auto" w:after="120"/>
+    </w:pPr>
     <w:rPr>
-      <w:rFonts w:ascii="Calibri" w:hAnsi="Calibri"/>
-      <w:color w:val="334155"/>
+      <w:rFonts w:ascii="Arial" w:hAnsi="Arial"/>
+      <w:color w:val="000000"/>
       <w:sz w:val="22"/>
     </w:rPr>
   </w:style>
@@ -712,11 +1055,11 @@
       <w:outlineLvl w:val="0"/>
     </w:pPr>
     <w:rPr>
-      <w:rFonts w:asciiTheme="majorHAnsi" w:eastAsiaTheme="majorEastAsia" w:hAnsiTheme="majorHAnsi" w:cstheme="majorBidi" w:ascii="Arial" w:hAnsi="Arial"/>
+      <w:rFonts w:asciiTheme="majorHAnsi" w:eastAsiaTheme="majorEastAsia" w:hAnsiTheme="majorHAnsi" w:cstheme="majorBidi"/>
       <w:b/>
       <w:bCs/>
-      <w:color w:val="0F172A"/>
-      <w:sz w:val="36"/>
+      <w:color w:val="365F91" w:themeColor="accent1" w:themeShade="BF"/>
+      <w:sz w:val="28"/>
       <w:szCs w:val="28"/>
     </w:rPr>
   </w:style>
@@ -736,11 +1079,11 @@
       <w:outlineLvl w:val="1"/>
     </w:pPr>
     <w:rPr>
-      <w:rFonts w:asciiTheme="majorHAnsi" w:eastAsiaTheme="majorEastAsia" w:hAnsiTheme="majorHAnsi" w:cstheme="majorBidi" w:ascii="Arial" w:hAnsi="Arial"/>
+      <w:rFonts w:asciiTheme="majorHAnsi" w:eastAsiaTheme="majorEastAsia" w:hAnsiTheme="majorHAnsi" w:cstheme="majorBidi"/>
       <w:b/>
       <w:bCs/>
-      <w:color w:val="2563EB"/>
-      <w:sz w:val="28"/>
+      <w:color w:val="4F81BD" w:themeColor="accent1"/>
+      <w:sz w:val="26"/>
       <w:szCs w:val="26"/>
     </w:rPr>
   </w:style>
@@ -760,11 +1103,10 @@
       <w:outlineLvl w:val="2"/>
     </w:pPr>
     <w:rPr>
-      <w:rFonts w:asciiTheme="majorHAnsi" w:eastAsiaTheme="majorEastAsia" w:hAnsiTheme="majorHAnsi" w:cstheme="majorBidi" w:ascii="Arial" w:hAnsi="Arial"/>
+      <w:rFonts w:asciiTheme="majorHAnsi" w:eastAsiaTheme="majorEastAsia" w:hAnsiTheme="majorHAnsi" w:cstheme="majorBidi"/>
       <w:b/>
       <w:bCs/>
-      <w:color w:val="475569"/>
-      <w:sz w:val="24"/>
+      <w:color w:val="4F81BD" w:themeColor="accent1"/>
     </w:rPr>
   </w:style>
   <w:style w:type="paragraph" w:styleId="Heading4">

</xml_diff>

<commit_message>
Revise Project Documentation docx to exactly match template structure and add performance testing docx
</commit_message>
<xml_diff>
--- a/8.Project Demonstration/Demonstration of Proposed Features.docx
+++ b/8.Project Demonstration/Demonstration of Proposed Features.docx
@@ -4,16 +4,224 @@
   <w:body>
     <w:p>
       <w:pPr>
-        <w:spacing w:before="480" w:after="240"/>
+        <w:spacing w:after="240"/>
+        <w:jc w:val="center"/>
+      </w:pPr>
+    </w:p>
+    <w:p>
+      <w:pPr>
+        <w:spacing w:before="120" w:after="240"/>
+        <w:jc w:val="center"/>
       </w:pPr>
       <w:r>
         <w:rPr>
           <w:b/>
           <w:color w:val="1F4E79"/>
-          <w:sz w:val="44"/>
+          <w:sz w:val="36"/>
         </w:rPr>
         <w:t>Demonstration of Proposed Features</w:t>
       </w:r>
+    </w:p>
+    <w:tbl>
+      <w:tblPr>
+        <w:tblStyle w:val="TableGrid"/>
+        <w:tblW w:w="0" w:type="auto"/>
+        <w:tblLook w:val="04A0" w:firstRow="1" w:lastRow="0" w:firstColumn="1" w:lastColumn="0" w:noHBand="0" w:noVBand="1"/>
+      </w:tblPr>
+      <w:tblGrid>
+        <w:gridCol w:w="2590"/>
+        <w:gridCol w:w="6760"/>
+      </w:tblGrid>
+      <w:tr>
+        <w:tc>
+          <w:tcPr>
+            <w:tcW w:w="2592" w:type="dxa"/>
+            <w:tcMar>
+              <w:top w:w="60" w:type="dxa"/>
+              <w:left w:w="100" w:type="dxa"/>
+              <w:bottom w:w="60" w:type="dxa"/>
+              <w:right w:w="100" w:type="dxa"/>
+            </w:tcMar>
+          </w:tcPr>
+          <w:p>
+            <w:pPr>
+              <w:spacing w:after="0"/>
+            </w:pPr>
+            <w:r>
+              <w:rPr>
+                <w:b/>
+                <w:sz w:val="20"/>
+              </w:rPr>
+              <w:t>Date</w:t>
+            </w:r>
+          </w:p>
+        </w:tc>
+        <w:tc>
+          <w:tcPr>
+            <w:tcW w:w="6768" w:type="dxa"/>
+            <w:tcMar>
+              <w:top w:w="60" w:type="dxa"/>
+              <w:left w:w="100" w:type="dxa"/>
+              <w:bottom w:w="60" w:type="dxa"/>
+              <w:right w:w="100" w:type="dxa"/>
+            </w:tcMar>
+          </w:tcPr>
+          <w:p>
+            <w:pPr>
+              <w:spacing w:after="0"/>
+            </w:pPr>
+            <w:r>
+              <w:rPr>
+                <w:color w:val="505050"/>
+                <w:sz w:val="20"/>
+              </w:rPr>
+              <w:t>03 July 2026</w:t>
+            </w:r>
+          </w:p>
+        </w:tc>
+      </w:tr>
+      <w:tr>
+        <w:tc>
+          <w:tcPr>
+            <w:tcW w:w="2592" w:type="dxa"/>
+            <w:tcMar>
+              <w:top w:w="60" w:type="dxa"/>
+              <w:left w:w="100" w:type="dxa"/>
+              <w:bottom w:w="60" w:type="dxa"/>
+              <w:right w:w="100" w:type="dxa"/>
+            </w:tcMar>
+          </w:tcPr>
+          <w:p>
+            <w:pPr>
+              <w:spacing w:after="0"/>
+            </w:pPr>
+            <w:r>
+              <w:rPr>
+                <w:b/>
+                <w:sz w:val="20"/>
+              </w:rPr>
+              <w:t>Team ID</w:t>
+            </w:r>
+          </w:p>
+        </w:tc>
+        <w:tc>
+          <w:tcPr>
+            <w:tcW w:w="6768" w:type="dxa"/>
+            <w:tcMar>
+              <w:top w:w="60" w:type="dxa"/>
+              <w:left w:w="100" w:type="dxa"/>
+              <w:bottom w:w="60" w:type="dxa"/>
+              <w:right w:w="100" w:type="dxa"/>
+            </w:tcMar>
+          </w:tcPr>
+          <w:p>
+            <w:pPr>
+              <w:spacing w:after="0"/>
+            </w:pPr>
+          </w:p>
+        </w:tc>
+      </w:tr>
+      <w:tr>
+        <w:tc>
+          <w:tcPr>
+            <w:tcW w:w="2592" w:type="dxa"/>
+            <w:tcMar>
+              <w:top w:w="60" w:type="dxa"/>
+              <w:left w:w="100" w:type="dxa"/>
+              <w:bottom w:w="60" w:type="dxa"/>
+              <w:right w:w="100" w:type="dxa"/>
+            </w:tcMar>
+          </w:tcPr>
+          <w:p>
+            <w:pPr>
+              <w:spacing w:after="0"/>
+            </w:pPr>
+            <w:r>
+              <w:rPr>
+                <w:b/>
+                <w:sz w:val="20"/>
+              </w:rPr>
+              <w:t>Project Name</w:t>
+            </w:r>
+          </w:p>
+        </w:tc>
+        <w:tc>
+          <w:tcPr>
+            <w:tcW w:w="6768" w:type="dxa"/>
+            <w:tcMar>
+              <w:top w:w="60" w:type="dxa"/>
+              <w:left w:w="100" w:type="dxa"/>
+              <w:bottom w:w="60" w:type="dxa"/>
+              <w:right w:w="100" w:type="dxa"/>
+            </w:tcMar>
+          </w:tcPr>
+          <w:p>
+            <w:pPr>
+              <w:spacing w:after="0"/>
+            </w:pPr>
+            <w:r>
+              <w:rPr>
+                <w:color w:val="505050"/>
+                <w:sz w:val="20"/>
+              </w:rPr>
+              <w:t>Predicting Human Development Index (HDI) Using Machine Learning</w:t>
+            </w:r>
+          </w:p>
+        </w:tc>
+      </w:tr>
+      <w:tr>
+        <w:tc>
+          <w:tcPr>
+            <w:tcW w:w="2592" w:type="dxa"/>
+            <w:tcMar>
+              <w:top w:w="60" w:type="dxa"/>
+              <w:left w:w="100" w:type="dxa"/>
+              <w:bottom w:w="60" w:type="dxa"/>
+              <w:right w:w="100" w:type="dxa"/>
+            </w:tcMar>
+          </w:tcPr>
+          <w:p>
+            <w:pPr>
+              <w:spacing w:after="0"/>
+            </w:pPr>
+            <w:r>
+              <w:rPr>
+                <w:b/>
+                <w:sz w:val="20"/>
+              </w:rPr>
+              <w:t>Maximum Marks</w:t>
+            </w:r>
+          </w:p>
+        </w:tc>
+        <w:tc>
+          <w:tcPr>
+            <w:tcW w:w="6768" w:type="dxa"/>
+            <w:tcMar>
+              <w:top w:w="60" w:type="dxa"/>
+              <w:left w:w="100" w:type="dxa"/>
+              <w:bottom w:w="60" w:type="dxa"/>
+              <w:right w:w="100" w:type="dxa"/>
+            </w:tcMar>
+          </w:tcPr>
+          <w:p>
+            <w:pPr>
+              <w:spacing w:after="0"/>
+            </w:pPr>
+            <w:r>
+              <w:rPr>
+                <w:color w:val="505050"/>
+                <w:sz w:val="20"/>
+              </w:rPr>
+              <w:t>1 Mark</w:t>
+            </w:r>
+          </w:p>
+        </w:tc>
+      </w:tr>
+    </w:tbl>
+    <w:p>
+      <w:pPr>
+        <w:spacing w:before="240"/>
+      </w:pPr>
     </w:p>
     <w:p>
       <w:pPr>
@@ -90,7 +298,15 @@
         <w:pStyle w:val="ListBullet"/>
       </w:pPr>
       <w:r>
-        <w:t>• Three glassmorphic cards representing the three dimensions of HDI: Health, Knowledge/Education, and Standard of Living.</w:t>
+        <w:t xml:space="preserve">• Three </w:t>
+      </w:r>
+      <w:proofErr w:type="spellStart"/>
+      <w:r>
+        <w:t>glassmorphic</w:t>
+      </w:r>
+      <w:proofErr w:type="spellEnd"/>
+      <w:r>
+        <w:t xml:space="preserve"> cards representing the three dimensions of HDI: Health, Knowledge/Education, and Standard of Living.</w:t>
       </w:r>
     </w:p>
     <w:p>
@@ -181,6 +397,7 @@
           <w:color w:val="3F3F3F"/>
           <w:sz w:val="28"/>
         </w:rPr>
+        <w:lastRenderedPageBreak/>
         <w:t>2.3 Feature 3: Dynamic Result Visualizations</w:t>
       </w:r>
     </w:p>
@@ -220,7 +437,6 @@
         <w:pStyle w:val="ListBullet"/>
       </w:pPr>
       <w:r>
-        <w:lastRenderedPageBreak/>
         <w:t>• HDI Gauge: A gradient progress meter positioning the country's level on the full human development spectrum.</w:t>
       </w:r>
     </w:p>
@@ -258,9 +474,9 @@
         <w:tblLook w:val="04A0" w:firstRow="1" w:lastRow="0" w:firstColumn="1" w:lastColumn="0" w:noHBand="0" w:noVBand="1"/>
       </w:tblPr>
       <w:tblGrid>
-        <w:gridCol w:w="3120"/>
-        <w:gridCol w:w="3120"/>
-        <w:gridCol w:w="3120"/>
+        <w:gridCol w:w="3118"/>
+        <w:gridCol w:w="3116"/>
+        <w:gridCol w:w="3116"/>
       </w:tblGrid>
       <w:tr>
         <w:tc>
@@ -635,10 +851,1393 @@
     </w:tbl>
     <w:p>
       <w:pPr>
+        <w:spacing w:before="240"/>
+      </w:pPr>
+    </w:p>
+    <w:p>
+      <w:pPr>
+        <w:pStyle w:val="Heading1"/>
+        <w:spacing w:before="240" w:after="120"/>
+      </w:pPr>
+      <w:r>
+        <w:rPr>
+          <w:rFonts w:ascii="Arial" w:hAnsi="Arial"/>
+          <w:color w:val="1F4E79"/>
+          <w:sz w:val="32"/>
+        </w:rPr>
+        <w:t>4. Demonstration of Proposed Features:</w:t>
+      </w:r>
+    </w:p>
+    <w:p>
+      <w:r>
+        <w:t>This document presents the features proposed during the planning phase of the HDI Prediction System project and confirms whether each feature was successfully implemented and demonstrated. The project was developed to provide an intelligent Machine Learning-based HDI prediction system that assists policymakers in assessing development levels using socio-economic indicators.</w:t>
+      </w:r>
+    </w:p>
+    <w:tbl>
+      <w:tblPr>
+        <w:tblStyle w:val="TableGrid"/>
+        <w:tblW w:w="0" w:type="auto"/>
+        <w:tblLook w:val="04A0" w:firstRow="1" w:lastRow="0" w:firstColumn="1" w:lastColumn="0" w:noHBand="0" w:noVBand="1"/>
+      </w:tblPr>
+      <w:tblGrid>
+        <w:gridCol w:w="1336"/>
+        <w:gridCol w:w="1494"/>
+        <w:gridCol w:w="1803"/>
+        <w:gridCol w:w="1613"/>
+        <w:gridCol w:w="1585"/>
+        <w:gridCol w:w="1519"/>
+      </w:tblGrid>
+      <w:tr>
+        <w:tc>
+          <w:tcPr>
+            <w:tcW w:w="1560" w:type="dxa"/>
+            <w:shd w:val="clear" w:color="auto" w:fill="1F4E79"/>
+            <w:tcMar>
+              <w:top w:w="80" w:type="dxa"/>
+              <w:left w:w="120" w:type="dxa"/>
+              <w:bottom w:w="80" w:type="dxa"/>
+              <w:right w:w="120" w:type="dxa"/>
+            </w:tcMar>
+          </w:tcPr>
+          <w:p>
+            <w:r>
+              <w:rPr>
+                <w:b/>
+                <w:color w:val="FFFFFF"/>
+                <w:sz w:val="20"/>
+              </w:rPr>
+              <w:lastRenderedPageBreak/>
+              <w:t>S.No</w:t>
+            </w:r>
+          </w:p>
+        </w:tc>
+        <w:tc>
+          <w:tcPr>
+            <w:tcW w:w="1560" w:type="dxa"/>
+            <w:shd w:val="clear" w:color="auto" w:fill="1F4E79"/>
+            <w:tcMar>
+              <w:top w:w="80" w:type="dxa"/>
+              <w:left w:w="120" w:type="dxa"/>
+              <w:bottom w:w="80" w:type="dxa"/>
+              <w:right w:w="120" w:type="dxa"/>
+            </w:tcMar>
+          </w:tcPr>
+          <w:p>
+            <w:r>
+              <w:rPr>
+                <w:b/>
+                <w:color w:val="FFFFFF"/>
+                <w:sz w:val="20"/>
+              </w:rPr>
+              <w:t>Feature Name</w:t>
+            </w:r>
+          </w:p>
+        </w:tc>
+        <w:tc>
+          <w:tcPr>
+            <w:tcW w:w="1560" w:type="dxa"/>
+            <w:shd w:val="clear" w:color="auto" w:fill="1F4E79"/>
+            <w:tcMar>
+              <w:top w:w="80" w:type="dxa"/>
+              <w:left w:w="120" w:type="dxa"/>
+              <w:bottom w:w="80" w:type="dxa"/>
+              <w:right w:w="120" w:type="dxa"/>
+            </w:tcMar>
+          </w:tcPr>
+          <w:p>
+            <w:r>
+              <w:rPr>
+                <w:b/>
+                <w:color w:val="FFFFFF"/>
+                <w:sz w:val="20"/>
+              </w:rPr>
+              <w:t>Description</w:t>
+            </w:r>
+          </w:p>
+        </w:tc>
+        <w:tc>
+          <w:tcPr>
+            <w:tcW w:w="1560" w:type="dxa"/>
+            <w:shd w:val="clear" w:color="auto" w:fill="1F4E79"/>
+            <w:tcMar>
+              <w:top w:w="80" w:type="dxa"/>
+              <w:left w:w="120" w:type="dxa"/>
+              <w:bottom w:w="80" w:type="dxa"/>
+              <w:right w:w="120" w:type="dxa"/>
+            </w:tcMar>
+          </w:tcPr>
+          <w:p>
+            <w:r>
+              <w:rPr>
+                <w:b/>
+                <w:color w:val="FFFFFF"/>
+                <w:sz w:val="20"/>
+              </w:rPr>
+              <w:t>Status (Implemented / Partial / Pending)</w:t>
+            </w:r>
+          </w:p>
+        </w:tc>
+        <w:tc>
+          <w:tcPr>
+            <w:tcW w:w="1560" w:type="dxa"/>
+            <w:shd w:val="clear" w:color="auto" w:fill="1F4E79"/>
+            <w:tcMar>
+              <w:top w:w="80" w:type="dxa"/>
+              <w:left w:w="120" w:type="dxa"/>
+              <w:bottom w:w="80" w:type="dxa"/>
+              <w:right w:w="120" w:type="dxa"/>
+            </w:tcMar>
+          </w:tcPr>
+          <w:p>
+            <w:r>
+              <w:rPr>
+                <w:b/>
+                <w:color w:val="FFFFFF"/>
+                <w:sz w:val="20"/>
+              </w:rPr>
+              <w:t>Demonstrated (Yes / No)</w:t>
+            </w:r>
+          </w:p>
+        </w:tc>
+        <w:tc>
+          <w:tcPr>
+            <w:tcW w:w="1560" w:type="dxa"/>
+            <w:shd w:val="clear" w:color="auto" w:fill="1F4E79"/>
+            <w:tcMar>
+              <w:top w:w="80" w:type="dxa"/>
+              <w:left w:w="120" w:type="dxa"/>
+              <w:bottom w:w="80" w:type="dxa"/>
+              <w:right w:w="120" w:type="dxa"/>
+            </w:tcMar>
+          </w:tcPr>
+          <w:p>
+            <w:r>
+              <w:rPr>
+                <w:b/>
+                <w:color w:val="FFFFFF"/>
+                <w:sz w:val="20"/>
+              </w:rPr>
+              <w:t>Remarks</w:t>
+            </w:r>
+          </w:p>
+        </w:tc>
+      </w:tr>
+      <w:tr>
+        <w:tc>
+          <w:tcPr>
+            <w:tcW w:w="1560" w:type="dxa"/>
+            <w:tcMar>
+              <w:top w:w="80" w:type="dxa"/>
+              <w:left w:w="120" w:type="dxa"/>
+              <w:bottom w:w="80" w:type="dxa"/>
+              <w:right w:w="120" w:type="dxa"/>
+            </w:tcMar>
+          </w:tcPr>
+          <w:p>
+            <w:r>
+              <w:rPr>
+                <w:sz w:val="19"/>
+              </w:rPr>
+              <w:t>1</w:t>
+            </w:r>
+          </w:p>
+        </w:tc>
+        <w:tc>
+          <w:tcPr>
+            <w:tcW w:w="1560" w:type="dxa"/>
+            <w:tcMar>
+              <w:top w:w="80" w:type="dxa"/>
+              <w:left w:w="120" w:type="dxa"/>
+              <w:bottom w:w="80" w:type="dxa"/>
+              <w:right w:w="120" w:type="dxa"/>
+            </w:tcMar>
+          </w:tcPr>
+          <w:p>
+            <w:r>
+              <w:rPr>
+                <w:sz w:val="19"/>
+              </w:rPr>
+              <w:t>HDI Score Prediction</w:t>
+            </w:r>
+          </w:p>
+        </w:tc>
+        <w:tc>
+          <w:tcPr>
+            <w:tcW w:w="1560" w:type="dxa"/>
+            <w:tcMar>
+              <w:top w:w="80" w:type="dxa"/>
+              <w:left w:w="120" w:type="dxa"/>
+              <w:bottom w:w="80" w:type="dxa"/>
+              <w:right w:w="120" w:type="dxa"/>
+            </w:tcMar>
+          </w:tcPr>
+          <w:p>
+            <w:r>
+              <w:rPr>
+                <w:sz w:val="19"/>
+              </w:rPr>
+              <w:t>Predicts continuous HDI scores based on country and socio-economic indicators (Life Expectancy, Schooling, GNI).</w:t>
+            </w:r>
+          </w:p>
+        </w:tc>
+        <w:tc>
+          <w:tcPr>
+            <w:tcW w:w="1560" w:type="dxa"/>
+            <w:tcMar>
+              <w:top w:w="80" w:type="dxa"/>
+              <w:left w:w="120" w:type="dxa"/>
+              <w:bottom w:w="80" w:type="dxa"/>
+              <w:right w:w="120" w:type="dxa"/>
+            </w:tcMar>
+          </w:tcPr>
+          <w:p>
+            <w:r>
+              <w:rPr>
+                <w:sz w:val="19"/>
+              </w:rPr>
+              <w:t>IMPLEMENTED</w:t>
+            </w:r>
+          </w:p>
+        </w:tc>
+        <w:tc>
+          <w:tcPr>
+            <w:tcW w:w="1560" w:type="dxa"/>
+            <w:tcMar>
+              <w:top w:w="80" w:type="dxa"/>
+              <w:left w:w="120" w:type="dxa"/>
+              <w:bottom w:w="80" w:type="dxa"/>
+              <w:right w:w="120" w:type="dxa"/>
+            </w:tcMar>
+          </w:tcPr>
+          <w:p>
+            <w:r>
+              <w:rPr>
+                <w:sz w:val="19"/>
+              </w:rPr>
+              <w:t>YES</w:t>
+            </w:r>
+          </w:p>
+        </w:tc>
+        <w:tc>
+          <w:tcPr>
+            <w:tcW w:w="1560" w:type="dxa"/>
+            <w:tcMar>
+              <w:top w:w="80" w:type="dxa"/>
+              <w:left w:w="120" w:type="dxa"/>
+              <w:bottom w:w="80" w:type="dxa"/>
+              <w:right w:w="120" w:type="dxa"/>
+            </w:tcMar>
+          </w:tcPr>
+          <w:p>
+            <w:r>
+              <w:rPr>
+                <w:sz w:val="19"/>
+              </w:rPr>
+              <w:t>Successfully demonstrated using the trained Linear Regression model.</w:t>
+            </w:r>
+          </w:p>
+        </w:tc>
+      </w:tr>
+      <w:tr>
+        <w:tc>
+          <w:tcPr>
+            <w:tcW w:w="1560" w:type="dxa"/>
+            <w:shd w:val="clear" w:color="auto" w:fill="F2F5F8"/>
+            <w:tcMar>
+              <w:top w:w="80" w:type="dxa"/>
+              <w:left w:w="120" w:type="dxa"/>
+              <w:bottom w:w="80" w:type="dxa"/>
+              <w:right w:w="120" w:type="dxa"/>
+            </w:tcMar>
+          </w:tcPr>
+          <w:p>
+            <w:r>
+              <w:rPr>
+                <w:sz w:val="19"/>
+              </w:rPr>
+              <w:t>2</w:t>
+            </w:r>
+          </w:p>
+        </w:tc>
+        <w:tc>
+          <w:tcPr>
+            <w:tcW w:w="1560" w:type="dxa"/>
+            <w:shd w:val="clear" w:color="auto" w:fill="F2F5F8"/>
+            <w:tcMar>
+              <w:top w:w="80" w:type="dxa"/>
+              <w:left w:w="120" w:type="dxa"/>
+              <w:bottom w:w="80" w:type="dxa"/>
+              <w:right w:w="120" w:type="dxa"/>
+            </w:tcMar>
+          </w:tcPr>
+          <w:p>
+            <w:r>
+              <w:rPr>
+                <w:sz w:val="19"/>
+              </w:rPr>
+              <w:t>Machine Learning Model Integration</w:t>
+            </w:r>
+          </w:p>
+        </w:tc>
+        <w:tc>
+          <w:tcPr>
+            <w:tcW w:w="1560" w:type="dxa"/>
+            <w:shd w:val="clear" w:color="auto" w:fill="F2F5F8"/>
+            <w:tcMar>
+              <w:top w:w="80" w:type="dxa"/>
+              <w:left w:w="120" w:type="dxa"/>
+              <w:bottom w:w="80" w:type="dxa"/>
+              <w:right w:w="120" w:type="dxa"/>
+            </w:tcMar>
+          </w:tcPr>
+          <w:p>
+            <w:r>
+              <w:rPr>
+                <w:sz w:val="19"/>
+              </w:rPr>
+              <w:t>Flask application loads the trained Linear Regression model and LabelEncoder to generate predictions.</w:t>
+            </w:r>
+          </w:p>
+        </w:tc>
+        <w:tc>
+          <w:tcPr>
+            <w:tcW w:w="1560" w:type="dxa"/>
+            <w:shd w:val="clear" w:color="auto" w:fill="F2F5F8"/>
+            <w:tcMar>
+              <w:top w:w="80" w:type="dxa"/>
+              <w:left w:w="120" w:type="dxa"/>
+              <w:bottom w:w="80" w:type="dxa"/>
+              <w:right w:w="120" w:type="dxa"/>
+            </w:tcMar>
+          </w:tcPr>
+          <w:p>
+            <w:r>
+              <w:rPr>
+                <w:sz w:val="19"/>
+              </w:rPr>
+              <w:t>IMPLEMENTED</w:t>
+            </w:r>
+          </w:p>
+        </w:tc>
+        <w:tc>
+          <w:tcPr>
+            <w:tcW w:w="1560" w:type="dxa"/>
+            <w:shd w:val="clear" w:color="auto" w:fill="F2F5F8"/>
+            <w:tcMar>
+              <w:top w:w="80" w:type="dxa"/>
+              <w:left w:w="120" w:type="dxa"/>
+              <w:bottom w:w="80" w:type="dxa"/>
+              <w:right w:w="120" w:type="dxa"/>
+            </w:tcMar>
+          </w:tcPr>
+          <w:p>
+            <w:r>
+              <w:rPr>
+                <w:sz w:val="19"/>
+              </w:rPr>
+              <w:t>YES</w:t>
+            </w:r>
+          </w:p>
+        </w:tc>
+        <w:tc>
+          <w:tcPr>
+            <w:tcW w:w="1560" w:type="dxa"/>
+            <w:shd w:val="clear" w:color="auto" w:fill="F2F5F8"/>
+            <w:tcMar>
+              <w:top w:w="80" w:type="dxa"/>
+              <w:left w:w="120" w:type="dxa"/>
+              <w:bottom w:w="80" w:type="dxa"/>
+              <w:right w:w="120" w:type="dxa"/>
+            </w:tcMar>
+          </w:tcPr>
+          <w:p>
+            <w:r>
+              <w:rPr>
+                <w:sz w:val="19"/>
+              </w:rPr>
+              <w:t>Model loaded successfully and produced accurate predictions.</w:t>
+            </w:r>
+          </w:p>
+        </w:tc>
+      </w:tr>
+      <w:tr>
+        <w:tc>
+          <w:tcPr>
+            <w:tcW w:w="1560" w:type="dxa"/>
+            <w:tcMar>
+              <w:top w:w="80" w:type="dxa"/>
+              <w:left w:w="120" w:type="dxa"/>
+              <w:bottom w:w="80" w:type="dxa"/>
+              <w:right w:w="120" w:type="dxa"/>
+            </w:tcMar>
+          </w:tcPr>
+          <w:p>
+            <w:r>
+              <w:rPr>
+                <w:sz w:val="19"/>
+              </w:rPr>
+              <w:t>3</w:t>
+            </w:r>
+          </w:p>
+        </w:tc>
+        <w:tc>
+          <w:tcPr>
+            <w:tcW w:w="1560" w:type="dxa"/>
+            <w:tcMar>
+              <w:top w:w="80" w:type="dxa"/>
+              <w:left w:w="120" w:type="dxa"/>
+              <w:bottom w:w="80" w:type="dxa"/>
+              <w:right w:w="120" w:type="dxa"/>
+            </w:tcMar>
+          </w:tcPr>
+          <w:p>
+            <w:r>
+              <w:rPr>
+                <w:sz w:val="19"/>
+              </w:rPr>
+              <w:t>Input Validation</w:t>
+            </w:r>
+          </w:p>
+        </w:tc>
+        <w:tc>
+          <w:tcPr>
+            <w:tcW w:w="1560" w:type="dxa"/>
+            <w:tcMar>
+              <w:top w:w="80" w:type="dxa"/>
+              <w:left w:w="120" w:type="dxa"/>
+              <w:bottom w:w="80" w:type="dxa"/>
+              <w:right w:w="120" w:type="dxa"/>
+            </w:tcMar>
+          </w:tcPr>
+          <w:p>
+            <w:r>
+              <w:rPr>
+                <w:sz w:val="19"/>
+              </w:rPr>
+              <w:t>Validates all socio-economic inputs on both client-side and server-side before prediction.</w:t>
+            </w:r>
+          </w:p>
+        </w:tc>
+        <w:tc>
+          <w:tcPr>
+            <w:tcW w:w="1560" w:type="dxa"/>
+            <w:tcMar>
+              <w:top w:w="80" w:type="dxa"/>
+              <w:left w:w="120" w:type="dxa"/>
+              <w:bottom w:w="80" w:type="dxa"/>
+              <w:right w:w="120" w:type="dxa"/>
+            </w:tcMar>
+          </w:tcPr>
+          <w:p>
+            <w:r>
+              <w:rPr>
+                <w:sz w:val="19"/>
+              </w:rPr>
+              <w:t>IMPLEMENTED</w:t>
+            </w:r>
+          </w:p>
+        </w:tc>
+        <w:tc>
+          <w:tcPr>
+            <w:tcW w:w="1560" w:type="dxa"/>
+            <w:tcMar>
+              <w:top w:w="80" w:type="dxa"/>
+              <w:left w:w="120" w:type="dxa"/>
+              <w:bottom w:w="80" w:type="dxa"/>
+              <w:right w:w="120" w:type="dxa"/>
+            </w:tcMar>
+          </w:tcPr>
+          <w:p>
+            <w:r>
+              <w:rPr>
+                <w:sz w:val="19"/>
+              </w:rPr>
+              <w:t>YES</w:t>
+            </w:r>
+          </w:p>
+        </w:tc>
+        <w:tc>
+          <w:tcPr>
+            <w:tcW w:w="1560" w:type="dxa"/>
+            <w:tcMar>
+              <w:top w:w="80" w:type="dxa"/>
+              <w:left w:w="120" w:type="dxa"/>
+              <w:bottom w:w="80" w:type="dxa"/>
+              <w:right w:w="120" w:type="dxa"/>
+            </w:tcMar>
+          </w:tcPr>
+          <w:p>
+            <w:r>
+              <w:rPr>
+                <w:sz w:val="19"/>
+              </w:rPr>
+              <w:t>Prevents invalid or incomplete input values.</w:t>
+            </w:r>
+          </w:p>
+        </w:tc>
+      </w:tr>
+      <w:tr>
+        <w:tc>
+          <w:tcPr>
+            <w:tcW w:w="1560" w:type="dxa"/>
+            <w:shd w:val="clear" w:color="auto" w:fill="F2F5F8"/>
+            <w:tcMar>
+              <w:top w:w="80" w:type="dxa"/>
+              <w:left w:w="120" w:type="dxa"/>
+              <w:bottom w:w="80" w:type="dxa"/>
+              <w:right w:w="120" w:type="dxa"/>
+            </w:tcMar>
+          </w:tcPr>
+          <w:p>
+            <w:r>
+              <w:rPr>
+                <w:sz w:val="19"/>
+              </w:rPr>
+              <w:t>4</w:t>
+            </w:r>
+          </w:p>
+        </w:tc>
+        <w:tc>
+          <w:tcPr>
+            <w:tcW w:w="1560" w:type="dxa"/>
+            <w:shd w:val="clear" w:color="auto" w:fill="F2F5F8"/>
+            <w:tcMar>
+              <w:top w:w="80" w:type="dxa"/>
+              <w:left w:w="120" w:type="dxa"/>
+              <w:bottom w:w="80" w:type="dxa"/>
+              <w:right w:w="120" w:type="dxa"/>
+            </w:tcMar>
+          </w:tcPr>
+          <w:p>
+            <w:r>
+              <w:rPr>
+                <w:sz w:val="19"/>
+              </w:rPr>
+              <w:t>Prediction Result Dashboard</w:t>
+            </w:r>
+          </w:p>
+        </w:tc>
+        <w:tc>
+          <w:tcPr>
+            <w:tcW w:w="1560" w:type="dxa"/>
+            <w:shd w:val="clear" w:color="auto" w:fill="F2F5F8"/>
+            <w:tcMar>
+              <w:top w:w="80" w:type="dxa"/>
+              <w:left w:w="120" w:type="dxa"/>
+              <w:bottom w:w="80" w:type="dxa"/>
+              <w:right w:w="120" w:type="dxa"/>
+            </w:tcMar>
+          </w:tcPr>
+          <w:p>
+            <w:r>
+              <w:rPr>
+                <w:sz w:val="19"/>
+              </w:rPr>
+              <w:t>Displays predicted HDI score, development tier (Very High, High, Medium, Low), and policy recommendations.</w:t>
+            </w:r>
+          </w:p>
+        </w:tc>
+        <w:tc>
+          <w:tcPr>
+            <w:tcW w:w="1560" w:type="dxa"/>
+            <w:shd w:val="clear" w:color="auto" w:fill="F2F5F8"/>
+            <w:tcMar>
+              <w:top w:w="80" w:type="dxa"/>
+              <w:left w:w="120" w:type="dxa"/>
+              <w:bottom w:w="80" w:type="dxa"/>
+              <w:right w:w="120" w:type="dxa"/>
+            </w:tcMar>
+          </w:tcPr>
+          <w:p>
+            <w:r>
+              <w:rPr>
+                <w:sz w:val="19"/>
+              </w:rPr>
+              <w:t>IMPLEMENTED</w:t>
+            </w:r>
+          </w:p>
+        </w:tc>
+        <w:tc>
+          <w:tcPr>
+            <w:tcW w:w="1560" w:type="dxa"/>
+            <w:shd w:val="clear" w:color="auto" w:fill="F2F5F8"/>
+            <w:tcMar>
+              <w:top w:w="80" w:type="dxa"/>
+              <w:left w:w="120" w:type="dxa"/>
+              <w:bottom w:w="80" w:type="dxa"/>
+              <w:right w:w="120" w:type="dxa"/>
+            </w:tcMar>
+          </w:tcPr>
+          <w:p>
+            <w:r>
+              <w:rPr>
+                <w:sz w:val="19"/>
+              </w:rPr>
+              <w:t>YES</w:t>
+            </w:r>
+          </w:p>
+        </w:tc>
+        <w:tc>
+          <w:tcPr>
+            <w:tcW w:w="1560" w:type="dxa"/>
+            <w:shd w:val="clear" w:color="auto" w:fill="F2F5F8"/>
+            <w:tcMar>
+              <w:top w:w="80" w:type="dxa"/>
+              <w:left w:w="120" w:type="dxa"/>
+              <w:bottom w:w="80" w:type="dxa"/>
+              <w:right w:w="120" w:type="dxa"/>
+            </w:tcMar>
+          </w:tcPr>
+          <w:p>
+            <w:r>
+              <w:rPr>
+                <w:sz w:val="19"/>
+              </w:rPr>
+              <w:t>Prediction results displayed dynamically after user input.</w:t>
+            </w:r>
+          </w:p>
+        </w:tc>
+      </w:tr>
+      <w:tr>
+        <w:tc>
+          <w:tcPr>
+            <w:tcW w:w="1560" w:type="dxa"/>
+            <w:tcMar>
+              <w:top w:w="80" w:type="dxa"/>
+              <w:left w:w="120" w:type="dxa"/>
+              <w:bottom w:w="80" w:type="dxa"/>
+              <w:right w:w="120" w:type="dxa"/>
+            </w:tcMar>
+          </w:tcPr>
+          <w:p>
+            <w:r>
+              <w:rPr>
+                <w:sz w:val="19"/>
+              </w:rPr>
+              <w:t>5</w:t>
+            </w:r>
+          </w:p>
+        </w:tc>
+        <w:tc>
+          <w:tcPr>
+            <w:tcW w:w="1560" w:type="dxa"/>
+            <w:tcMar>
+              <w:top w:w="80" w:type="dxa"/>
+              <w:left w:w="120" w:type="dxa"/>
+              <w:bottom w:w="80" w:type="dxa"/>
+              <w:right w:w="120" w:type="dxa"/>
+            </w:tcMar>
+          </w:tcPr>
+          <w:p>
+            <w:r>
+              <w:rPr>
+                <w:sz w:val="19"/>
+              </w:rPr>
+              <w:t>Data Visualization Dashboard</w:t>
+            </w:r>
+          </w:p>
+        </w:tc>
+        <w:tc>
+          <w:tcPr>
+            <w:tcW w:w="1560" w:type="dxa"/>
+            <w:tcMar>
+              <w:top w:w="80" w:type="dxa"/>
+              <w:left w:w="120" w:type="dxa"/>
+              <w:bottom w:w="80" w:type="dxa"/>
+              <w:right w:w="120" w:type="dxa"/>
+            </w:tcMar>
+          </w:tcPr>
+          <w:p>
+            <w:r>
+              <w:rPr>
+                <w:sz w:val="19"/>
+              </w:rPr>
+              <w:t>Generates statistical charts including strip plots, heatmaps, and actual vs. predicted graphs.</w:t>
+            </w:r>
+          </w:p>
+        </w:tc>
+        <w:tc>
+          <w:tcPr>
+            <w:tcW w:w="1560" w:type="dxa"/>
+            <w:tcMar>
+              <w:top w:w="80" w:type="dxa"/>
+              <w:left w:w="120" w:type="dxa"/>
+              <w:bottom w:w="80" w:type="dxa"/>
+              <w:right w:w="120" w:type="dxa"/>
+            </w:tcMar>
+          </w:tcPr>
+          <w:p>
+            <w:r>
+              <w:rPr>
+                <w:sz w:val="19"/>
+              </w:rPr>
+              <w:t>IMPLEMENTED</w:t>
+            </w:r>
+          </w:p>
+        </w:tc>
+        <w:tc>
+          <w:tcPr>
+            <w:tcW w:w="1560" w:type="dxa"/>
+            <w:tcMar>
+              <w:top w:w="80" w:type="dxa"/>
+              <w:left w:w="120" w:type="dxa"/>
+              <w:bottom w:w="80" w:type="dxa"/>
+              <w:right w:w="120" w:type="dxa"/>
+            </w:tcMar>
+          </w:tcPr>
+          <w:p>
+            <w:r>
+              <w:rPr>
+                <w:sz w:val="19"/>
+              </w:rPr>
+              <w:t>YES</w:t>
+            </w:r>
+          </w:p>
+        </w:tc>
+        <w:tc>
+          <w:tcPr>
+            <w:tcW w:w="1560" w:type="dxa"/>
+            <w:tcMar>
+              <w:top w:w="80" w:type="dxa"/>
+              <w:left w:w="120" w:type="dxa"/>
+              <w:bottom w:w="80" w:type="dxa"/>
+              <w:right w:w="120" w:type="dxa"/>
+            </w:tcMar>
+          </w:tcPr>
+          <w:p>
+            <w:r>
+              <w:rPr>
+                <w:sz w:val="19"/>
+              </w:rPr>
+              <w:t>Visualizations successfully generated during model analysis.</w:t>
+            </w:r>
+          </w:p>
+        </w:tc>
+      </w:tr>
+      <w:tr>
+        <w:tc>
+          <w:tcPr>
+            <w:tcW w:w="1560" w:type="dxa"/>
+            <w:shd w:val="clear" w:color="auto" w:fill="F2F5F8"/>
+            <w:tcMar>
+              <w:top w:w="80" w:type="dxa"/>
+              <w:left w:w="120" w:type="dxa"/>
+              <w:bottom w:w="80" w:type="dxa"/>
+              <w:right w:w="120" w:type="dxa"/>
+            </w:tcMar>
+          </w:tcPr>
+          <w:p>
+            <w:r>
+              <w:rPr>
+                <w:sz w:val="19"/>
+              </w:rPr>
+              <w:t>6</w:t>
+            </w:r>
+          </w:p>
+        </w:tc>
+        <w:tc>
+          <w:tcPr>
+            <w:tcW w:w="1560" w:type="dxa"/>
+            <w:shd w:val="clear" w:color="auto" w:fill="F2F5F8"/>
+            <w:tcMar>
+              <w:top w:w="80" w:type="dxa"/>
+              <w:left w:w="120" w:type="dxa"/>
+              <w:bottom w:w="80" w:type="dxa"/>
+              <w:right w:w="120" w:type="dxa"/>
+            </w:tcMar>
+          </w:tcPr>
+          <w:p>
+            <w:r>
+              <w:rPr>
+                <w:sz w:val="19"/>
+              </w:rPr>
+              <w:t>Responsive Web Interface</w:t>
+            </w:r>
+          </w:p>
+        </w:tc>
+        <w:tc>
+          <w:tcPr>
+            <w:tcW w:w="1560" w:type="dxa"/>
+            <w:shd w:val="clear" w:color="auto" w:fill="F2F5F8"/>
+            <w:tcMar>
+              <w:top w:w="80" w:type="dxa"/>
+              <w:left w:w="120" w:type="dxa"/>
+              <w:bottom w:w="80" w:type="dxa"/>
+              <w:right w:w="120" w:type="dxa"/>
+            </w:tcMar>
+          </w:tcPr>
+          <w:p>
+            <w:r>
+              <w:rPr>
+                <w:sz w:val="19"/>
+              </w:rPr>
+              <w:t>Provides a responsive and user-friendly interface accessible from desktop and mobile browsers.</w:t>
+            </w:r>
+          </w:p>
+        </w:tc>
+        <w:tc>
+          <w:tcPr>
+            <w:tcW w:w="1560" w:type="dxa"/>
+            <w:shd w:val="clear" w:color="auto" w:fill="F2F5F8"/>
+            <w:tcMar>
+              <w:top w:w="80" w:type="dxa"/>
+              <w:left w:w="120" w:type="dxa"/>
+              <w:bottom w:w="80" w:type="dxa"/>
+              <w:right w:w="120" w:type="dxa"/>
+            </w:tcMar>
+          </w:tcPr>
+          <w:p>
+            <w:r>
+              <w:rPr>
+                <w:sz w:val="19"/>
+              </w:rPr>
+              <w:t>IMPLEMENTED</w:t>
+            </w:r>
+          </w:p>
+        </w:tc>
+        <w:tc>
+          <w:tcPr>
+            <w:tcW w:w="1560" w:type="dxa"/>
+            <w:shd w:val="clear" w:color="auto" w:fill="F2F5F8"/>
+            <w:tcMar>
+              <w:top w:w="80" w:type="dxa"/>
+              <w:left w:w="120" w:type="dxa"/>
+              <w:bottom w:w="80" w:type="dxa"/>
+              <w:right w:w="120" w:type="dxa"/>
+            </w:tcMar>
+          </w:tcPr>
+          <w:p>
+            <w:r>
+              <w:rPr>
+                <w:sz w:val="19"/>
+              </w:rPr>
+              <w:t>YES</w:t>
+            </w:r>
+          </w:p>
+        </w:tc>
+        <w:tc>
+          <w:tcPr>
+            <w:tcW w:w="1560" w:type="dxa"/>
+            <w:shd w:val="clear" w:color="auto" w:fill="F2F5F8"/>
+            <w:tcMar>
+              <w:top w:w="80" w:type="dxa"/>
+              <w:left w:w="120" w:type="dxa"/>
+              <w:bottom w:w="80" w:type="dxa"/>
+              <w:right w:w="120" w:type="dxa"/>
+            </w:tcMar>
+          </w:tcPr>
+          <w:p>
+            <w:r>
+              <w:rPr>
+                <w:sz w:val="19"/>
+              </w:rPr>
+              <w:t>Successfully demonstrated across different screen sizes.</w:t>
+            </w:r>
+          </w:p>
+        </w:tc>
+      </w:tr>
+      <w:tr>
+        <w:tc>
+          <w:tcPr>
+            <w:tcW w:w="1560" w:type="dxa"/>
+            <w:tcMar>
+              <w:top w:w="80" w:type="dxa"/>
+              <w:left w:w="120" w:type="dxa"/>
+              <w:bottom w:w="80" w:type="dxa"/>
+              <w:right w:w="120" w:type="dxa"/>
+            </w:tcMar>
+          </w:tcPr>
+          <w:p>
+            <w:r>
+              <w:rPr>
+                <w:sz w:val="19"/>
+              </w:rPr>
+              <w:t>7</w:t>
+            </w:r>
+          </w:p>
+        </w:tc>
+        <w:tc>
+          <w:tcPr>
+            <w:tcW w:w="1560" w:type="dxa"/>
+            <w:tcMar>
+              <w:top w:w="80" w:type="dxa"/>
+              <w:left w:w="120" w:type="dxa"/>
+              <w:bottom w:w="80" w:type="dxa"/>
+              <w:right w:w="120" w:type="dxa"/>
+            </w:tcMar>
+          </w:tcPr>
+          <w:p>
+            <w:r>
+              <w:rPr>
+                <w:sz w:val="19"/>
+              </w:rPr>
+              <w:t>Prediction History</w:t>
+            </w:r>
+          </w:p>
+        </w:tc>
+        <w:tc>
+          <w:tcPr>
+            <w:tcW w:w="1560" w:type="dxa"/>
+            <w:tcMar>
+              <w:top w:w="80" w:type="dxa"/>
+              <w:left w:w="120" w:type="dxa"/>
+              <w:bottom w:w="80" w:type="dxa"/>
+              <w:right w:w="120" w:type="dxa"/>
+            </w:tcMar>
+          </w:tcPr>
+          <w:p>
+            <w:r>
+              <w:rPr>
+                <w:sz w:val="19"/>
+              </w:rPr>
+              <w:t xml:space="preserve">Maintains recent prediction history </w:t>
+            </w:r>
+            <w:r>
+              <w:rPr>
+                <w:sz w:val="19"/>
+              </w:rPr>
+              <w:lastRenderedPageBreak/>
+              <w:t>during the active user session.</w:t>
+            </w:r>
+          </w:p>
+        </w:tc>
+        <w:tc>
+          <w:tcPr>
+            <w:tcW w:w="1560" w:type="dxa"/>
+            <w:tcMar>
+              <w:top w:w="80" w:type="dxa"/>
+              <w:left w:w="120" w:type="dxa"/>
+              <w:bottom w:w="80" w:type="dxa"/>
+              <w:right w:w="120" w:type="dxa"/>
+            </w:tcMar>
+          </w:tcPr>
+          <w:p>
+            <w:r>
+              <w:rPr>
+                <w:sz w:val="19"/>
+              </w:rPr>
+              <w:lastRenderedPageBreak/>
+              <w:t>IMPLEMENTED</w:t>
+            </w:r>
+          </w:p>
+        </w:tc>
+        <w:tc>
+          <w:tcPr>
+            <w:tcW w:w="1560" w:type="dxa"/>
+            <w:tcMar>
+              <w:top w:w="80" w:type="dxa"/>
+              <w:left w:w="120" w:type="dxa"/>
+              <w:bottom w:w="80" w:type="dxa"/>
+              <w:right w:w="120" w:type="dxa"/>
+            </w:tcMar>
+          </w:tcPr>
+          <w:p>
+            <w:r>
+              <w:rPr>
+                <w:sz w:val="19"/>
+              </w:rPr>
+              <w:t>YES</w:t>
+            </w:r>
+          </w:p>
+        </w:tc>
+        <w:tc>
+          <w:tcPr>
+            <w:tcW w:w="1560" w:type="dxa"/>
+            <w:tcMar>
+              <w:top w:w="80" w:type="dxa"/>
+              <w:left w:w="120" w:type="dxa"/>
+              <w:bottom w:w="80" w:type="dxa"/>
+              <w:right w:w="120" w:type="dxa"/>
+            </w:tcMar>
+          </w:tcPr>
+          <w:p>
+            <w:r>
+              <w:rPr>
+                <w:sz w:val="19"/>
+              </w:rPr>
+              <w:t xml:space="preserve">Enables users to review previous </w:t>
+            </w:r>
+            <w:r>
+              <w:rPr>
+                <w:sz w:val="19"/>
+              </w:rPr>
+              <w:lastRenderedPageBreak/>
+              <w:t>prediction results.</w:t>
+            </w:r>
+          </w:p>
+        </w:tc>
+      </w:tr>
+      <w:tr>
+        <w:tc>
+          <w:tcPr>
+            <w:tcW w:w="1560" w:type="dxa"/>
+            <w:shd w:val="clear" w:color="auto" w:fill="F2F5F8"/>
+            <w:tcMar>
+              <w:top w:w="80" w:type="dxa"/>
+              <w:left w:w="120" w:type="dxa"/>
+              <w:bottom w:w="80" w:type="dxa"/>
+              <w:right w:w="120" w:type="dxa"/>
+            </w:tcMar>
+          </w:tcPr>
+          <w:p>
+            <w:r>
+              <w:rPr>
+                <w:sz w:val="19"/>
+              </w:rPr>
+              <w:lastRenderedPageBreak/>
+              <w:t>8</w:t>
+            </w:r>
+          </w:p>
+        </w:tc>
+        <w:tc>
+          <w:tcPr>
+            <w:tcW w:w="1560" w:type="dxa"/>
+            <w:shd w:val="clear" w:color="auto" w:fill="F2F5F8"/>
+            <w:tcMar>
+              <w:top w:w="80" w:type="dxa"/>
+              <w:left w:w="120" w:type="dxa"/>
+              <w:bottom w:w="80" w:type="dxa"/>
+              <w:right w:w="120" w:type="dxa"/>
+            </w:tcMar>
+          </w:tcPr>
+          <w:p>
+            <w:r>
+              <w:rPr>
+                <w:sz w:val="19"/>
+              </w:rPr>
+              <w:t>Cloud Deployment Support</w:t>
+            </w:r>
+          </w:p>
+        </w:tc>
+        <w:tc>
+          <w:tcPr>
+            <w:tcW w:w="1560" w:type="dxa"/>
+            <w:shd w:val="clear" w:color="auto" w:fill="F2F5F8"/>
+            <w:tcMar>
+              <w:top w:w="80" w:type="dxa"/>
+              <w:left w:w="120" w:type="dxa"/>
+              <w:bottom w:w="80" w:type="dxa"/>
+              <w:right w:w="120" w:type="dxa"/>
+            </w:tcMar>
+          </w:tcPr>
+          <w:p>
+            <w:r>
+              <w:rPr>
+                <w:sz w:val="19"/>
+              </w:rPr>
+              <w:t>Project is structured for future deployment on IBM Cloud, Render, or similar cloud platforms.</w:t>
+            </w:r>
+          </w:p>
+        </w:tc>
+        <w:tc>
+          <w:tcPr>
+            <w:tcW w:w="1560" w:type="dxa"/>
+            <w:shd w:val="clear" w:color="auto" w:fill="F2F5F8"/>
+            <w:tcMar>
+              <w:top w:w="80" w:type="dxa"/>
+              <w:left w:w="120" w:type="dxa"/>
+              <w:bottom w:w="80" w:type="dxa"/>
+              <w:right w:w="120" w:type="dxa"/>
+            </w:tcMar>
+          </w:tcPr>
+          <w:p>
+            <w:r>
+              <w:rPr>
+                <w:sz w:val="19"/>
+              </w:rPr>
+              <w:t>PARTIAL</w:t>
+            </w:r>
+          </w:p>
+        </w:tc>
+        <w:tc>
+          <w:tcPr>
+            <w:tcW w:w="1560" w:type="dxa"/>
+            <w:shd w:val="clear" w:color="auto" w:fill="F2F5F8"/>
+            <w:tcMar>
+              <w:top w:w="80" w:type="dxa"/>
+              <w:left w:w="120" w:type="dxa"/>
+              <w:bottom w:w="80" w:type="dxa"/>
+              <w:right w:w="120" w:type="dxa"/>
+            </w:tcMar>
+          </w:tcPr>
+          <w:p>
+            <w:r>
+              <w:rPr>
+                <w:sz w:val="19"/>
+              </w:rPr>
+              <w:t>NO</w:t>
+            </w:r>
+          </w:p>
+        </w:tc>
+        <w:tc>
+          <w:tcPr>
+            <w:tcW w:w="1560" w:type="dxa"/>
+            <w:shd w:val="clear" w:color="auto" w:fill="F2F5F8"/>
+            <w:tcMar>
+              <w:top w:w="80" w:type="dxa"/>
+              <w:left w:w="120" w:type="dxa"/>
+              <w:bottom w:w="80" w:type="dxa"/>
+              <w:right w:w="120" w:type="dxa"/>
+            </w:tcMar>
+          </w:tcPr>
+          <w:p>
+            <w:r>
+              <w:rPr>
+                <w:sz w:val="19"/>
+              </w:rPr>
+              <w:t>Architecture supports deployment; production deployment is planned as future work.</w:t>
+            </w:r>
+          </w:p>
+        </w:tc>
+      </w:tr>
+    </w:tbl>
+    <w:p>
+      <w:pPr>
+        <w:spacing w:before="80" w:after="160"/>
+      </w:pPr>
+    </w:p>
+    <w:p>
+      <w:pPr>
+        <w:pStyle w:val="Heading1"/>
+        <w:spacing w:before="240" w:after="120"/>
+      </w:pPr>
+      <w:r>
+        <w:rPr>
+          <w:rFonts w:ascii="Arial" w:hAnsi="Arial"/>
+          <w:color w:val="1F4E79"/>
+          <w:sz w:val="32"/>
+        </w:rPr>
+        <w:t>5. Feature Implementation Summary:</w:t>
+      </w:r>
+    </w:p>
+    <w:tbl>
+      <w:tblPr>
+        <w:tblStyle w:val="TableGrid"/>
+        <w:tblW w:w="0" w:type="auto"/>
+        <w:tblLook w:val="04A0" w:firstRow="1" w:lastRow="0" w:firstColumn="1" w:lastColumn="0" w:noHBand="0" w:noVBand="1"/>
+      </w:tblPr>
+      <w:tblGrid>
+        <w:gridCol w:w="4676"/>
+        <w:gridCol w:w="4674"/>
+      </w:tblGrid>
+      <w:tr>
+        <w:tc>
+          <w:tcPr>
+            <w:tcW w:w="4680" w:type="dxa"/>
+            <w:shd w:val="clear" w:color="auto" w:fill="1F4E79"/>
+            <w:tcMar>
+              <w:top w:w="80" w:type="dxa"/>
+              <w:left w:w="120" w:type="dxa"/>
+              <w:bottom w:w="80" w:type="dxa"/>
+              <w:right w:w="120" w:type="dxa"/>
+            </w:tcMar>
+          </w:tcPr>
+          <w:p>
+            <w:r>
+              <w:rPr>
+                <w:b/>
+                <w:color w:val="FFFFFF"/>
+                <w:sz w:val="20"/>
+              </w:rPr>
+              <w:t>Metric</w:t>
+            </w:r>
+          </w:p>
+        </w:tc>
+        <w:tc>
+          <w:tcPr>
+            <w:tcW w:w="4680" w:type="dxa"/>
+            <w:shd w:val="clear" w:color="auto" w:fill="1F4E79"/>
+            <w:tcMar>
+              <w:top w:w="80" w:type="dxa"/>
+              <w:left w:w="120" w:type="dxa"/>
+              <w:bottom w:w="80" w:type="dxa"/>
+              <w:right w:w="120" w:type="dxa"/>
+            </w:tcMar>
+          </w:tcPr>
+          <w:p>
+            <w:r>
+              <w:rPr>
+                <w:b/>
+                <w:color w:val="FFFFFF"/>
+                <w:sz w:val="20"/>
+              </w:rPr>
+              <w:t>Value</w:t>
+            </w:r>
+          </w:p>
+        </w:tc>
+      </w:tr>
+      <w:tr>
+        <w:tc>
+          <w:tcPr>
+            <w:tcW w:w="4680" w:type="dxa"/>
+            <w:tcMar>
+              <w:top w:w="80" w:type="dxa"/>
+              <w:left w:w="120" w:type="dxa"/>
+              <w:bottom w:w="80" w:type="dxa"/>
+              <w:right w:w="120" w:type="dxa"/>
+            </w:tcMar>
+          </w:tcPr>
+          <w:p>
+            <w:r>
+              <w:rPr>
+                <w:sz w:val="19"/>
+              </w:rPr>
+              <w:t>Total Features Proposed</w:t>
+            </w:r>
+          </w:p>
+        </w:tc>
+        <w:tc>
+          <w:tcPr>
+            <w:tcW w:w="4680" w:type="dxa"/>
+            <w:tcMar>
+              <w:top w:w="80" w:type="dxa"/>
+              <w:left w:w="120" w:type="dxa"/>
+              <w:bottom w:w="80" w:type="dxa"/>
+              <w:right w:w="120" w:type="dxa"/>
+            </w:tcMar>
+          </w:tcPr>
+          <w:p>
+            <w:r>
+              <w:rPr>
+                <w:sz w:val="19"/>
+              </w:rPr>
+              <w:t>8</w:t>
+            </w:r>
+          </w:p>
+        </w:tc>
+      </w:tr>
+      <w:tr>
+        <w:tc>
+          <w:tcPr>
+            <w:tcW w:w="4680" w:type="dxa"/>
+            <w:shd w:val="clear" w:color="auto" w:fill="F2F5F8"/>
+            <w:tcMar>
+              <w:top w:w="80" w:type="dxa"/>
+              <w:left w:w="120" w:type="dxa"/>
+              <w:bottom w:w="80" w:type="dxa"/>
+              <w:right w:w="120" w:type="dxa"/>
+            </w:tcMar>
+          </w:tcPr>
+          <w:p>
+            <w:r>
+              <w:rPr>
+                <w:sz w:val="19"/>
+              </w:rPr>
+              <w:t>Total Features Implemented</w:t>
+            </w:r>
+          </w:p>
+        </w:tc>
+        <w:tc>
+          <w:tcPr>
+            <w:tcW w:w="4680" w:type="dxa"/>
+            <w:shd w:val="clear" w:color="auto" w:fill="F2F5F8"/>
+            <w:tcMar>
+              <w:top w:w="80" w:type="dxa"/>
+              <w:left w:w="120" w:type="dxa"/>
+              <w:bottom w:w="80" w:type="dxa"/>
+              <w:right w:w="120" w:type="dxa"/>
+            </w:tcMar>
+          </w:tcPr>
+          <w:p>
+            <w:r>
+              <w:rPr>
+                <w:sz w:val="19"/>
+              </w:rPr>
+              <w:t>7</w:t>
+            </w:r>
+          </w:p>
+        </w:tc>
+      </w:tr>
+      <w:tr>
+        <w:tc>
+          <w:tcPr>
+            <w:tcW w:w="4680" w:type="dxa"/>
+            <w:tcMar>
+              <w:top w:w="80" w:type="dxa"/>
+              <w:left w:w="120" w:type="dxa"/>
+              <w:bottom w:w="80" w:type="dxa"/>
+              <w:right w:w="120" w:type="dxa"/>
+            </w:tcMar>
+          </w:tcPr>
+          <w:p>
+            <w:r>
+              <w:rPr>
+                <w:sz w:val="19"/>
+              </w:rPr>
+              <w:t>Total Features Demonstrated</w:t>
+            </w:r>
+          </w:p>
+        </w:tc>
+        <w:tc>
+          <w:tcPr>
+            <w:tcW w:w="4680" w:type="dxa"/>
+            <w:tcMar>
+              <w:top w:w="80" w:type="dxa"/>
+              <w:left w:w="120" w:type="dxa"/>
+              <w:bottom w:w="80" w:type="dxa"/>
+              <w:right w:w="120" w:type="dxa"/>
+            </w:tcMar>
+          </w:tcPr>
+          <w:p>
+            <w:r>
+              <w:rPr>
+                <w:sz w:val="19"/>
+              </w:rPr>
+              <w:t>7</w:t>
+            </w:r>
+          </w:p>
+        </w:tc>
+      </w:tr>
+      <w:tr>
+        <w:tc>
+          <w:tcPr>
+            <w:tcW w:w="4680" w:type="dxa"/>
+            <w:shd w:val="clear" w:color="auto" w:fill="F2F5F8"/>
+            <w:tcMar>
+              <w:top w:w="80" w:type="dxa"/>
+              <w:left w:w="120" w:type="dxa"/>
+              <w:bottom w:w="80" w:type="dxa"/>
+              <w:right w:w="120" w:type="dxa"/>
+            </w:tcMar>
+          </w:tcPr>
+          <w:p>
+            <w:r>
+              <w:rPr>
+                <w:sz w:val="19"/>
+              </w:rPr>
+              <w:t>Overall Implementation Rate</w:t>
+            </w:r>
+          </w:p>
+        </w:tc>
+        <w:tc>
+          <w:tcPr>
+            <w:tcW w:w="4680" w:type="dxa"/>
+            <w:shd w:val="clear" w:color="auto" w:fill="F2F5F8"/>
+            <w:tcMar>
+              <w:top w:w="80" w:type="dxa"/>
+              <w:left w:w="120" w:type="dxa"/>
+              <w:bottom w:w="80" w:type="dxa"/>
+              <w:right w:w="120" w:type="dxa"/>
+            </w:tcMar>
+          </w:tcPr>
+          <w:p>
+            <w:r>
+              <w:rPr>
+                <w:sz w:val="19"/>
+              </w:rPr>
+              <w:t>87.5%</w:t>
+            </w:r>
+          </w:p>
+        </w:tc>
+      </w:tr>
+    </w:tbl>
+    <w:p>
+      <w:pPr>
         <w:spacing w:before="80" w:after="160"/>
       </w:pPr>
     </w:p>
     <w:sectPr>
+      <w:headerReference w:type="default" r:id="rId8"/>
       <w:pgSz w:w="12240" w:h="15840"/>
       <w:pgMar w:top="1440" w:right="1440" w:bottom="1440" w:left="1440" w:header="720" w:footer="720" w:gutter="0"/>
       <w:cols w:space="720"/>
@@ -646,6 +2245,175 @@
     </w:sectPr>
   </w:body>
 </w:document>
+</file>
+
+<file path=word/endnotes.xml><?xml version="1.0" encoding="utf-8"?>
+<w:endnotes xmlns:wpc="http://schemas.microsoft.com/office/word/2010/wordprocessingCanvas" xmlns:cx="http://schemas.microsoft.com/office/drawing/2014/chartex" xmlns:cx1="http://schemas.microsoft.com/office/drawing/2015/9/8/chartex" xmlns:cx2="http://schemas.microsoft.com/office/drawing/2015/10/21/chartex" xmlns:cx3="http://schemas.microsoft.com/office/drawing/2016/5/9/chartex" xmlns:cx4="http://schemas.microsoft.com/office/drawing/2016/5/10/chartex" xmlns:cx5="http://schemas.microsoft.com/office/drawing/2016/5/11/chartex" xmlns:cx6="http://schemas.microsoft.com/office/drawing/2016/5/12/chartex" xmlns:cx7="http://schemas.microsoft.com/office/drawing/2016/5/13/chartex" xmlns:cx8="http://schemas.microsoft.com/office/drawing/2016/5/14/chartex" xmlns:mc="http://schemas.openxmlformats.org/markup-compatibility/2006" xmlns:aink="http://schemas.microsoft.com/office/drawing/2016/ink" xmlns:am3d="http://schemas.microsoft.com/office/drawing/2017/model3d" xmlns:o="urn:schemas-microsoft-com:office:office" xmlns:oel="http://schemas.microsoft.com/office/2019/extlst" xmlns:r="http://schemas.openxmlformats.org/officeDocument/2006/relationships" xmlns:m="http://schemas.openxmlformats.org/officeDocument/2006/math" xmlns:v="urn:schemas-microsoft-com:vml" xmlns:wp14="http://schemas.microsoft.com/office/word/2010/wordprocessingDrawing" xmlns:wp="http://schemas.openxmlformats.org/drawingml/2006/wordprocessingDrawing" xmlns:w10="urn:schemas-microsoft-com:office:word" xmlns:w="http://schemas.openxmlformats.org/wordprocessingml/2006/main" xmlns:w14="http://schemas.microsoft.com/office/word/2010/wordml" xmlns:w15="http://schemas.microsoft.com/office/word/2012/wordml" xmlns:w16cex="http://schemas.microsoft.com/office/word/2018/wordml/cex" xmlns:w16cid="http://schemas.microsoft.com/office/word/2016/wordml/cid" xmlns:w16="http://schemas.microsoft.com/office/word/2018/wordml" xmlns:w16du="http://schemas.microsoft.com/office/word/2023/wordml/word16du" xmlns:w16sdtdh="http://schemas.microsoft.com/office/word/2020/wordml/sdtdatahash" xmlns:w16sdtfl="http://schemas.microsoft.com/office/word/2024/wordml/sdtformatlock" xmlns:w16se="http://schemas.microsoft.com/office/word/2015/wordml/symex" xmlns:wpg="http://schemas.microsoft.com/office/word/2010/wordprocessingGroup" xmlns:wpi="http://schemas.microsoft.com/office/word/2010/wordprocessingInk" xmlns:wne="http://schemas.microsoft.com/office/word/2006/wordml" xmlns:wps="http://schemas.microsoft.com/office/word/2010/wordprocessingShape" mc:Ignorable="w14 w15 w16se w16cid w16 w16cex w16sdtdh w16sdtfl w16du wp14">
+  <w:endnote w:type="separator" w:id="-1">
+    <w:p>
+      <w:pPr>
+        <w:spacing w:after="0" w:line="240" w:lineRule="auto"/>
+      </w:pPr>
+      <w:r>
+        <w:separator/>
+      </w:r>
+    </w:p>
+  </w:endnote>
+  <w:endnote w:type="continuationSeparator" w:id="0">
+    <w:p>
+      <w:pPr>
+        <w:spacing w:after="0" w:line="240" w:lineRule="auto"/>
+      </w:pPr>
+      <w:r>
+        <w:continuationSeparator/>
+      </w:r>
+    </w:p>
+  </w:endnote>
+</w:endnotes>
+</file>
+
+<file path=word/footnotes.xml><?xml version="1.0" encoding="utf-8"?>
+<w:footnotes xmlns:wpc="http://schemas.microsoft.com/office/word/2010/wordprocessingCanvas" xmlns:cx="http://schemas.microsoft.com/office/drawing/2014/chartex" xmlns:cx1="http://schemas.microsoft.com/office/drawing/2015/9/8/chartex" xmlns:cx2="http://schemas.microsoft.com/office/drawing/2015/10/21/chartex" xmlns:cx3="http://schemas.microsoft.com/office/drawing/2016/5/9/chartex" xmlns:cx4="http://schemas.microsoft.com/office/drawing/2016/5/10/chartex" xmlns:cx5="http://schemas.microsoft.com/office/drawing/2016/5/11/chartex" xmlns:cx6="http://schemas.microsoft.com/office/drawing/2016/5/12/chartex" xmlns:cx7="http://schemas.microsoft.com/office/drawing/2016/5/13/chartex" xmlns:cx8="http://schemas.microsoft.com/office/drawing/2016/5/14/chartex" xmlns:mc="http://schemas.openxmlformats.org/markup-compatibility/2006" xmlns:aink="http://schemas.microsoft.com/office/drawing/2016/ink" xmlns:am3d="http://schemas.microsoft.com/office/drawing/2017/model3d" xmlns:o="urn:schemas-microsoft-com:office:office" xmlns:oel="http://schemas.microsoft.com/office/2019/extlst" xmlns:r="http://schemas.openxmlformats.org/officeDocument/2006/relationships" xmlns:m="http://schemas.openxmlformats.org/officeDocument/2006/math" xmlns:v="urn:schemas-microsoft-com:vml" xmlns:wp14="http://schemas.microsoft.com/office/word/2010/wordprocessingDrawing" xmlns:wp="http://schemas.openxmlformats.org/drawingml/2006/wordprocessingDrawing" xmlns:w10="urn:schemas-microsoft-com:office:word" xmlns:w="http://schemas.openxmlformats.org/wordprocessingml/2006/main" xmlns:w14="http://schemas.microsoft.com/office/word/2010/wordml" xmlns:w15="http://schemas.microsoft.com/office/word/2012/wordml" xmlns:w16cex="http://schemas.microsoft.com/office/word/2018/wordml/cex" xmlns:w16cid="http://schemas.microsoft.com/office/word/2016/wordml/cid" xmlns:w16="http://schemas.microsoft.com/office/word/2018/wordml" xmlns:w16du="http://schemas.microsoft.com/office/word/2023/wordml/word16du" xmlns:w16sdtdh="http://schemas.microsoft.com/office/word/2020/wordml/sdtdatahash" xmlns:w16sdtfl="http://schemas.microsoft.com/office/word/2024/wordml/sdtformatlock" xmlns:w16se="http://schemas.microsoft.com/office/word/2015/wordml/symex" xmlns:wpg="http://schemas.microsoft.com/office/word/2010/wordprocessingGroup" xmlns:wpi="http://schemas.microsoft.com/office/word/2010/wordprocessingInk" xmlns:wne="http://schemas.microsoft.com/office/word/2006/wordml" xmlns:wps="http://schemas.microsoft.com/office/word/2010/wordprocessingShape" mc:Ignorable="w14 w15 w16se w16cid w16 w16cex w16sdtdh w16sdtfl w16du wp14">
+  <w:footnote w:type="separator" w:id="-1">
+    <w:p>
+      <w:pPr>
+        <w:spacing w:after="0" w:line="240" w:lineRule="auto"/>
+      </w:pPr>
+      <w:r>
+        <w:separator/>
+      </w:r>
+    </w:p>
+  </w:footnote>
+  <w:footnote w:type="continuationSeparator" w:id="0">
+    <w:p>
+      <w:pPr>
+        <w:spacing w:after="0" w:line="240" w:lineRule="auto"/>
+      </w:pPr>
+      <w:r>
+        <w:continuationSeparator/>
+      </w:r>
+    </w:p>
+  </w:footnote>
+</w:footnotes>
+</file>
+
+<file path=word/header1.xml><?xml version="1.0" encoding="utf-8"?>
+<w:hdr xmlns:wpc="http://schemas.microsoft.com/office/word/2010/wordprocessingCanvas" xmlns:cx="http://schemas.microsoft.com/office/drawing/2014/chartex" xmlns:cx1="http://schemas.microsoft.com/office/drawing/2015/9/8/chartex" xmlns:cx2="http://schemas.microsoft.com/office/drawing/2015/10/21/chartex" xmlns:cx3="http://schemas.microsoft.com/office/drawing/2016/5/9/chartex" xmlns:cx4="http://schemas.microsoft.com/office/drawing/2016/5/10/chartex" xmlns:cx5="http://schemas.microsoft.com/office/drawing/2016/5/11/chartex" xmlns:cx6="http://schemas.microsoft.com/office/drawing/2016/5/12/chartex" xmlns:cx7="http://schemas.microsoft.com/office/drawing/2016/5/13/chartex" xmlns:cx8="http://schemas.microsoft.com/office/drawing/2016/5/14/chartex" xmlns:mc="http://schemas.openxmlformats.org/markup-compatibility/2006" xmlns:aink="http://schemas.microsoft.com/office/drawing/2016/ink" xmlns:am3d="http://schemas.microsoft.com/office/drawing/2017/model3d" xmlns:o="urn:schemas-microsoft-com:office:office" xmlns:oel="http://schemas.microsoft.com/office/2019/extlst" xmlns:r="http://schemas.openxmlformats.org/officeDocument/2006/relationships" xmlns:m="http://schemas.openxmlformats.org/officeDocument/2006/math" xmlns:v="urn:schemas-microsoft-com:vml" xmlns:wp14="http://schemas.microsoft.com/office/word/2010/wordprocessingDrawing" xmlns:wp="http://schemas.openxmlformats.org/drawingml/2006/wordprocessingDrawing" xmlns:w10="urn:schemas-microsoft-com:office:word" xmlns:w="http://schemas.openxmlformats.org/wordprocessingml/2006/main" xmlns:w14="http://schemas.microsoft.com/office/word/2010/wordml" xmlns:w15="http://schemas.microsoft.com/office/word/2012/wordml" xmlns:w16cex="http://schemas.microsoft.com/office/word/2018/wordml/cex" xmlns:w16cid="http://schemas.microsoft.com/office/word/2016/wordml/cid" xmlns:w16="http://schemas.microsoft.com/office/word/2018/wordml" xmlns:w16du="http://schemas.microsoft.com/office/word/2023/wordml/word16du" xmlns:w16sdtdh="http://schemas.microsoft.com/office/word/2020/wordml/sdtdatahash" xmlns:w16sdtfl="http://schemas.microsoft.com/office/word/2024/wordml/sdtformatlock" xmlns:w16se="http://schemas.microsoft.com/office/word/2015/wordml/symex" xmlns:wpg="http://schemas.microsoft.com/office/word/2010/wordprocessingGroup" xmlns:wpi="http://schemas.microsoft.com/office/word/2010/wordprocessingInk" xmlns:wne="http://schemas.microsoft.com/office/word/2006/wordml" xmlns:wps="http://schemas.microsoft.com/office/word/2010/wordprocessingShape" mc:Ignorable="w14 w15 w16se w16cid w16 w16cex w16sdtdh w16sdtfl w16du wp14">
+  <w:p>
+    <w:pPr>
+      <w:pStyle w:val="Header"/>
+    </w:pPr>
+    <w:r>
+      <w:rPr>
+        <w:noProof/>
+      </w:rPr>
+      <w:drawing>
+        <wp:inline distT="0" distB="0" distL="0" distR="0" wp14:anchorId="1199104E" wp14:editId="2E50305F">
+          <wp:extent cx="1333500" cy="358140"/>
+          <wp:effectExtent l="0" t="0" r="0" b="3810"/>
+          <wp:docPr id="1551868986" name="Picture 4" descr="SmartBridge"/>
+          <wp:cNvGraphicFramePr>
+            <a:graphicFrameLocks xmlns:a="http://schemas.openxmlformats.org/drawingml/2006/main" noChangeAspect="1"/>
+          </wp:cNvGraphicFramePr>
+          <a:graphic xmlns:a="http://schemas.openxmlformats.org/drawingml/2006/main">
+            <a:graphicData uri="http://schemas.openxmlformats.org/drawingml/2006/picture">
+              <pic:pic xmlns:pic="http://schemas.openxmlformats.org/drawingml/2006/picture">
+                <pic:nvPicPr>
+                  <pic:cNvPr id="0" name="Picture 4" descr="SmartBridge"/>
+                  <pic:cNvPicPr>
+                    <a:picLocks noChangeAspect="1" noChangeArrowheads="1"/>
+                  </pic:cNvPicPr>
+                </pic:nvPicPr>
+                <pic:blipFill>
+                  <a:blip r:embed="rId1">
+                    <a:extLst>
+                      <a:ext uri="{28A0092B-C50C-407E-A947-70E740481C1C}">
+                        <a14:useLocalDpi xmlns:a14="http://schemas.microsoft.com/office/drawing/2010/main" val="0"/>
+                      </a:ext>
+                    </a:extLst>
+                  </a:blip>
+                  <a:srcRect/>
+                  <a:stretch>
+                    <a:fillRect/>
+                  </a:stretch>
+                </pic:blipFill>
+                <pic:spPr bwMode="auto">
+                  <a:xfrm>
+                    <a:off x="0" y="0"/>
+                    <a:ext cx="1333500" cy="358140"/>
+                  </a:xfrm>
+                  <a:prstGeom prst="rect">
+                    <a:avLst/>
+                  </a:prstGeom>
+                  <a:noFill/>
+                  <a:ln>
+                    <a:noFill/>
+                  </a:ln>
+                </pic:spPr>
+              </pic:pic>
+            </a:graphicData>
+          </a:graphic>
+        </wp:inline>
+      </w:drawing>
+    </w:r>
+    <w:r>
+      <w:t xml:space="preserve">                                                                                              </w:t>
+    </w:r>
+    <w:r>
+      <w:rPr>
+        <w:noProof/>
+      </w:rPr>
+      <w:drawing>
+        <wp:inline distT="0" distB="0" distL="0" distR="0" wp14:anchorId="381336E2" wp14:editId="7D32EAEA">
+          <wp:extent cx="937260" cy="434340"/>
+          <wp:effectExtent l="0" t="0" r="0" b="3810"/>
+          <wp:docPr id="1496842629" name="Picture 3" descr="SkillWallet"/>
+          <wp:cNvGraphicFramePr>
+            <a:graphicFrameLocks xmlns:a="http://schemas.openxmlformats.org/drawingml/2006/main" noChangeAspect="1"/>
+          </wp:cNvGraphicFramePr>
+          <a:graphic xmlns:a="http://schemas.openxmlformats.org/drawingml/2006/main">
+            <a:graphicData uri="http://schemas.openxmlformats.org/drawingml/2006/picture">
+              <pic:pic xmlns:pic="http://schemas.openxmlformats.org/drawingml/2006/picture">
+                <pic:nvPicPr>
+                  <pic:cNvPr id="0" name="Picture 3" descr="SkillWallet"/>
+                  <pic:cNvPicPr>
+                    <a:picLocks noChangeAspect="1" noChangeArrowheads="1"/>
+                  </pic:cNvPicPr>
+                </pic:nvPicPr>
+                <pic:blipFill>
+                  <a:blip r:embed="rId2">
+                    <a:extLst>
+                      <a:ext uri="{28A0092B-C50C-407E-A947-70E740481C1C}">
+                        <a14:useLocalDpi xmlns:a14="http://schemas.microsoft.com/office/drawing/2010/main" val="0"/>
+                      </a:ext>
+                    </a:extLst>
+                  </a:blip>
+                  <a:srcRect/>
+                  <a:stretch>
+                    <a:fillRect/>
+                  </a:stretch>
+                </pic:blipFill>
+                <pic:spPr bwMode="auto">
+                  <a:xfrm>
+                    <a:off x="0" y="0"/>
+                    <a:ext cx="937260" cy="434340"/>
+                  </a:xfrm>
+                  <a:prstGeom prst="rect">
+                    <a:avLst/>
+                  </a:prstGeom>
+                  <a:noFill/>
+                  <a:ln>
+                    <a:noFill/>
+                  </a:ln>
+                </pic:spPr>
+              </pic:pic>
+            </a:graphicData>
+          </a:graphic>
+        </wp:inline>
+      </w:drawing>
+    </w:r>
+  </w:p>
+</w:hdr>
 </file>
 
 <file path=word/numbering.xml><?xml version="1.0" encoding="utf-8"?>
@@ -821,31 +2589,31 @@
       </w:rPr>
     </w:lvl>
   </w:abstractNum>
-  <w:num w:numId="1" w16cid:durableId="950891924">
+  <w:num w:numId="1" w16cid:durableId="799613458">
     <w:abstractNumId w:val="8"/>
   </w:num>
-  <w:num w:numId="2" w16cid:durableId="1999573716">
+  <w:num w:numId="2" w16cid:durableId="384914903">
     <w:abstractNumId w:val="6"/>
   </w:num>
-  <w:num w:numId="3" w16cid:durableId="1492988440">
+  <w:num w:numId="3" w16cid:durableId="1149829488">
     <w:abstractNumId w:val="5"/>
   </w:num>
-  <w:num w:numId="4" w16cid:durableId="1955667190">
+  <w:num w:numId="4" w16cid:durableId="410860136">
     <w:abstractNumId w:val="4"/>
   </w:num>
-  <w:num w:numId="5" w16cid:durableId="688143167">
+  <w:num w:numId="5" w16cid:durableId="232130137">
     <w:abstractNumId w:val="7"/>
   </w:num>
-  <w:num w:numId="6" w16cid:durableId="923076482">
+  <w:num w:numId="6" w16cid:durableId="271935748">
     <w:abstractNumId w:val="3"/>
   </w:num>
-  <w:num w:numId="7" w16cid:durableId="1056078991">
+  <w:num w:numId="7" w16cid:durableId="1876846598">
     <w:abstractNumId w:val="2"/>
   </w:num>
-  <w:num w:numId="8" w16cid:durableId="204104646">
+  <w:num w:numId="8" w16cid:durableId="1280799673">
     <w:abstractNumId w:val="1"/>
   </w:num>
-  <w:num w:numId="9" w16cid:durableId="1198466913">
+  <w:num w:numId="9" w16cid:durableId="218517737">
     <w:abstractNumId w:val="0"/>
   </w:num>
 </w:numbering>
@@ -1240,7 +3008,7 @@
   <w:style w:type="paragraph" w:default="1" w:styleId="Normal">
     <w:name w:val="Normal"/>
     <w:qFormat/>
-    <w:rsid w:val="00962152"/>
+    <w:rsid w:val="00FC693F"/>
     <w:pPr>
       <w:spacing w:after="120"/>
     </w:pPr>

</xml_diff>